<commit_message>
Rebuild final v3 Word manuscript with reviewer-strengthening sections
</commit_message>
<xml_diff>
--- a/manuscript/RA-MARS-journal-draft-final-v3.docx
+++ b/manuscript/RA-MARS-journal-draft-final-v3.docx
@@ -3351,7 +3351,7 @@
     </w:p>
     <w:bookmarkEnd w:id="65"/>
     <w:bookmarkEnd w:id="66"/>
-    <w:bookmarkStart w:id="84" w:name="experimental-setup"/>
+    <w:bookmarkStart w:id="88" w:name="experimental-setup"/>
     <w:p>
       <w:pPr>
         <w:pStyle w:val="Heading1"/>
@@ -5556,162 +5556,6 @@
         </w:pict>
       </w:r>
     </w:p>
-    <w:bookmarkEnd w:id="83"/>
-    <w:bookmarkEnd w:id="84"/>
-    <w:bookmarkStart w:id="90" w:name="v3-results-and-discussion"/>
-    <w:p>
-      <w:pPr>
-        <w:pStyle w:val="Heading1"/>
-      </w:pPr>
-      <w:r>
-        <w:t xml:space="preserve">v3 Results and Discussion</w:t>
-      </w:r>
-    </w:p>
-    <w:bookmarkStart w:id="85" w:name="X4c64ef5ecc9e2ebe57fef8a2d5dba9f54c78b99"/>
-    <w:p>
-      <w:pPr>
-        <w:pStyle w:val="Heading2"/>
-      </w:pPr>
-      <w:r>
-        <w:t xml:space="preserve">v3 Dataset and Sequence-Window Configuration</w:t>
-      </w:r>
-    </w:p>
-    <w:p>
-      <w:pPr>
-        <w:pStyle w:val="FirstParagraph"/>
-      </w:pPr>
-      <w:r>
-        <w:t xml:space="preserve">The optimized v3 evaluation uses synthetic multi-UAV telemetry data generated under normal, jamming, spoofing, tampering, and combined attack scenarios. The final v3 sample contains 90,000 sequence-safe telemetry rows and 16,875 time-series windows. Each window contains 20 telemetry steps and 9 raw non-leakage features per step.</w:t>
-      </w:r>
-    </w:p>
-    <w:p>
-      <w:pPr>
-        <w:pStyle w:val="BodyText"/>
-      </w:pPr>
-      <w:r>
-        <w:t xml:space="preserve">The classifier input excludes derived Mission Assurance Index and component scores to avoid feature leakage. The attack-detection task includes eight mission-state classes: normal, jamming, spoofing, tampering, jamming_spoofing, jamming_tampering, spoofing_tampering, and combined.</w:t>
-      </w:r>
-    </w:p>
-    <w:bookmarkEnd w:id="85"/>
-    <w:bookmarkStart w:id="86" w:name="v3-temporal-attack-detection-results"/>
-    <w:p>
-      <w:pPr>
-        <w:pStyle w:val="Heading2"/>
-      </w:pPr>
-      <w:r>
-        <w:t xml:space="preserve">v3 Temporal Attack-Detection Results</w:t>
-      </w:r>
-    </w:p>
-    <w:p>
-      <w:pPr>
-        <w:pStyle w:val="FirstParagraph"/>
-      </w:pPr>
-      <w:r>
-        <w:t xml:space="preserve">The v3 model evaluation compares classical sequence baselines, GRU/LSTM sequence models, and weighted GRU/LSTM models. The best macro-F1 model is Weighted LSTM, which achieved 75.25% accuracy, 58.10% macro precision, 60.91% macro recall, 57.02% macro F1-score, and 74.83% weighted F1-score.</w:t>
-      </w:r>
-    </w:p>
-    <w:p>
-      <w:pPr>
-        <w:pStyle w:val="BodyText"/>
-      </w:pPr>
-      <w:r>
-        <w:t xml:space="preserve">The best accuracy model is LSTM, which achieved 78.24% accuracy and 53.40% macro F1-score. The strongest classical baseline is Random Forest, which achieved 77.06% accuracy, 56.56% macro F1-score, and 74.72% weighted F1-score.</w:t>
-      </w:r>
-    </w:p>
-    <w:p>
-      <w:pPr>
-        <w:pStyle w:val="BodyText"/>
-      </w:pPr>
-      <w:r>
-        <w:t xml:space="preserve">These results are intentionally more conservative and realistic than the earlier v2 results because the v3 classifier uses temporal windows and excludes derived mission-assurance features from attack-classification input.</w:t>
-      </w:r>
-    </w:p>
-    <w:bookmarkEnd w:id="86"/>
-    <w:bookmarkStart w:id="87" w:name="v3-mission-assurance-results"/>
-    <w:p>
-      <w:pPr>
-        <w:pStyle w:val="Heading2"/>
-      </w:pPr>
-      <w:r>
-        <w:t xml:space="preserve">v3 Mission Assurance Results</w:t>
-      </w:r>
-    </w:p>
-    <w:p>
-      <w:pPr>
-        <w:pStyle w:val="FirstParagraph"/>
-      </w:pPr>
-      <w:r>
-        <w:t xml:space="preserve">Full RA-MARS achieved a Mission Assurance Index of 0.7291 ± 0.0057 and a mission success rate of 78.25 ± 0.46% under stressed attack scenarios. The packet delivery ratio was 0.9533, mean route deviation was 36.88 m, and the recovery-time proxy was 5.81 s.</w:t>
-      </w:r>
-    </w:p>
-    <w:p>
-      <w:pPr>
-        <w:pStyle w:val="BodyText"/>
-      </w:pPr>
-      <w:r>
-        <w:t xml:space="preserve">The ablation study shows that each major RA-MARS module contributes to mission-level resilience. Removing adaptive continuation reduced mission success to 61.82%. Removing the Mission Assurance Index reduced mission success to 65.73%. Removing digital twin action selection reduced mission success to 66.51%. Removing the navigation trust module reduced mission success to 64.17%.</w:t>
-      </w:r>
-    </w:p>
-    <w:bookmarkEnd w:id="87"/>
-    <w:bookmarkStart w:id="88" w:name="X8dc38df02bfc538211c64b0d417f09d249cd2f2"/>
-    <w:p>
-      <w:pPr>
-        <w:pStyle w:val="Heading2"/>
-      </w:pPr>
-      <w:r>
-        <w:t xml:space="preserve">v3 Scalability and Attack-Intensity Results</w:t>
-      </w:r>
-    </w:p>
-    <w:p>
-      <w:pPr>
-        <w:pStyle w:val="FirstParagraph"/>
-      </w:pPr>
-      <w:r>
-        <w:t xml:space="preserve">Scalability analysis shows that mission success remains stable across UAV swarm sizes. The mission success rate was 80.19 ± 0.63% for 10 UAVs, 79.42 ± 0.54% for 20 UAVs, and 79.38 ± 0.52% for 30 UAVs.</w:t>
-      </w:r>
-    </w:p>
-    <w:p>
-      <w:pPr>
-        <w:pStyle w:val="BodyText"/>
-      </w:pPr>
-      <w:r>
-        <w:t xml:space="preserve">Attack-intensity stress testing shows the expected degradation pattern. Mission success decreased from 81.34 ± 0.17% under low-intensity attacks to 79.70 ± 0.36% under medium-intensity attacks and 76.98 ± 0.62% under high-intensity attacks.</w:t>
-      </w:r>
-    </w:p>
-    <w:bookmarkEnd w:id="88"/>
-    <w:bookmarkStart w:id="89" w:name="v3-discussion"/>
-    <w:p>
-      <w:pPr>
-        <w:pStyle w:val="Heading2"/>
-      </w:pPr>
-      <w:r>
-        <w:t xml:space="preserve">v3 Discussion</w:t>
-      </w:r>
-    </w:p>
-    <w:p>
-      <w:pPr>
-        <w:pStyle w:val="FirstParagraph"/>
-      </w:pPr>
-      <w:r>
-        <w:t xml:space="preserve">The v3 evaluation supports the central claim that multi-UAV resilience should be evaluated through mission-assurance metrics rather than attack-classification accuracy alone. Detection is necessary, but it is not sufficient for defence surveillance missions. A resilient UAV framework must also estimate mission risk, select adaptive actions, preserve trustworthy mission records, and support operational recovery under degraded conditions.</w:t>
-      </w:r>
-    </w:p>
-    <w:p>
-      <w:pPr>
-        <w:pStyle w:val="BodyText"/>
-      </w:pPr>
-      <w:r>
-        <w:t xml:space="preserve">The ablation results show that adaptive continuation, Mission Assurance Index scoring, and digital twin action selection are the most important RA-MARS components for mission success. The attack-intensity and scalability results further show that RA-MARS maintains mission-level performance under increasing attack severity and larger UAV swarm sizes.</w:t>
-      </w:r>
-    </w:p>
-    <w:p>
-      <w:pPr>
-        <w:pStyle w:val="BodyText"/>
-      </w:pPr>
-      <w:r>
-        <w:t xml:space="preserve">The v3 results should be interpreted as simulation-based evidence. They do not represent real military UAV flight validation or battlefield deployment.</w:t>
-      </w:r>
-    </w:p>
     <w:p>
       <w:r>
         <w:pict>
@@ -5719,24 +5563,964 @@
         </w:pict>
       </w:r>
     </w:p>
-    <w:bookmarkEnd w:id="89"/>
-    <w:bookmarkEnd w:id="90"/>
-    <w:bookmarkStart w:id="93" w:name="limitations-and-future-work"/>
-    <w:p>
-      <w:pPr>
-        <w:pStyle w:val="Heading1"/>
-      </w:pPr>
-      <w:r>
-        <w:t xml:space="preserve">Limitations and Future Work</w:t>
-      </w:r>
-    </w:p>
-    <w:bookmarkStart w:id="91" w:name="limitations-1"/>
+    <w:bookmarkEnd w:id="83"/>
+    <w:bookmarkStart w:id="85" w:name="v3-prior-work-comparison"/>
     <w:p>
       <w:pPr>
         <w:pStyle w:val="Heading2"/>
       </w:pPr>
       <w:r>
-        <w:t xml:space="preserve">Limitations</w:t>
+        <w:t xml:space="preserve">v3 Prior Work Comparison</w:t>
+      </w:r>
+    </w:p>
+    <w:bookmarkStart w:id="84" w:name="X33da9431d4b8927dc9e24fe8ace50784167d4ab"/>
+    <w:p>
+      <w:pPr>
+        <w:pStyle w:val="Heading3"/>
+      </w:pPr>
+      <w:r>
+        <w:t xml:space="preserve">Table: Comparison of RA-MARS v3 With Prior UAV Security and Resilience Approaches</w:t>
+      </w:r>
+    </w:p>
+    <w:tbl>
+      <w:tblPr>
+        <w:tblStyle w:val="Table"/>
+        <w:tblW w:type="pct" w:w="5000"/>
+        <w:tblLayout w:type="fixed"/>
+        <w:tblLook w:firstRow="1" w:lastRow="0" w:firstColumn="0" w:lastColumn="0" w:noHBand="0" w:noVBand="0" w:val="0020"/>
+      </w:tblPr>
+      <w:tblGrid>
+        <w:gridCol w:w="678"/>
+        <w:gridCol w:w="905"/>
+        <w:gridCol w:w="905"/>
+        <w:gridCol w:w="905"/>
+        <w:gridCol w:w="905"/>
+        <w:gridCol w:w="905"/>
+        <w:gridCol w:w="905"/>
+        <w:gridCol w:w="905"/>
+        <w:gridCol w:w="905"/>
+      </w:tblGrid>
+      <w:tr>
+        <w:trPr>
+          <w:tblHeader w:val="on"/>
+        </w:trPr>
+        <w:tc>
+          <w:tcPr/>
+          <w:p>
+            <w:pPr>
+              <w:pStyle w:val="Compact"/>
+            </w:pPr>
+            <w:r>
+              <w:t xml:space="preserve">Research Direction</w:t>
+            </w:r>
+          </w:p>
+        </w:tc>
+        <w:tc>
+          <w:tcPr/>
+          <w:p>
+            <w:pPr>
+              <w:pStyle w:val="Compact"/>
+              <w:jc w:val="right"/>
+            </w:pPr>
+            <w:r>
+              <w:t xml:space="preserve">Jamming</w:t>
+            </w:r>
+          </w:p>
+        </w:tc>
+        <w:tc>
+          <w:tcPr/>
+          <w:p>
+            <w:pPr>
+              <w:pStyle w:val="Compact"/>
+              <w:jc w:val="right"/>
+            </w:pPr>
+            <w:r>
+              <w:t xml:space="preserve">GPS/GNSS Spoofing</w:t>
+            </w:r>
+          </w:p>
+        </w:tc>
+        <w:tc>
+          <w:tcPr/>
+          <w:p>
+            <w:pPr>
+              <w:pStyle w:val="Compact"/>
+              <w:jc w:val="right"/>
+            </w:pPr>
+            <w:r>
+              <w:t xml:space="preserve">Data Tampering</w:t>
+            </w:r>
+          </w:p>
+        </w:tc>
+        <w:tc>
+          <w:tcPr/>
+          <w:p>
+            <w:pPr>
+              <w:pStyle w:val="Compact"/>
+              <w:jc w:val="right"/>
+            </w:pPr>
+            <w:r>
+              <w:t xml:space="preserve">Temporal AI</w:t>
+            </w:r>
+          </w:p>
+        </w:tc>
+        <w:tc>
+          <w:tcPr/>
+          <w:p>
+            <w:pPr>
+              <w:pStyle w:val="Compact"/>
+              <w:jc w:val="right"/>
+            </w:pPr>
+            <w:r>
+              <w:t xml:space="preserve">Mission Assurance Metric</w:t>
+            </w:r>
+          </w:p>
+        </w:tc>
+        <w:tc>
+          <w:tcPr/>
+          <w:p>
+            <w:pPr>
+              <w:pStyle w:val="Compact"/>
+              <w:jc w:val="right"/>
+            </w:pPr>
+            <w:r>
+              <w:t xml:space="preserve">Digital Twin Action Selection</w:t>
+            </w:r>
+          </w:p>
+        </w:tc>
+        <w:tc>
+          <w:tcPr/>
+          <w:p>
+            <w:pPr>
+              <w:pStyle w:val="Compact"/>
+              <w:jc w:val="right"/>
+            </w:pPr>
+            <w:r>
+              <w:t xml:space="preserve">Ablation Study</w:t>
+            </w:r>
+          </w:p>
+        </w:tc>
+        <w:tc>
+          <w:tcPr/>
+          <w:p>
+            <w:pPr>
+              <w:pStyle w:val="Compact"/>
+              <w:jc w:val="right"/>
+            </w:pPr>
+            <w:r>
+              <w:t xml:space="preserve">Scalability Test</w:t>
+            </w:r>
+          </w:p>
+        </w:tc>
+      </w:tr>
+      <w:tr>
+        <w:tc>
+          <w:tcPr/>
+          <w:p>
+            <w:pPr>
+              <w:pStyle w:val="Compact"/>
+            </w:pPr>
+            <w:r>
+              <w:t xml:space="preserve">Anti-jamming UAV communication</w:t>
+            </w:r>
+          </w:p>
+        </w:tc>
+        <w:tc>
+          <w:tcPr/>
+          <w:p>
+            <w:pPr>
+              <w:pStyle w:val="Compact"/>
+              <w:jc w:val="right"/>
+            </w:pPr>
+            <w:r>
+              <w:t xml:space="preserve">Yes</w:t>
+            </w:r>
+          </w:p>
+        </w:tc>
+        <w:tc>
+          <w:tcPr/>
+          <w:p>
+            <w:pPr>
+              <w:pStyle w:val="Compact"/>
+              <w:jc w:val="right"/>
+            </w:pPr>
+            <w:r>
+              <w:t xml:space="preserve">No</w:t>
+            </w:r>
+          </w:p>
+        </w:tc>
+        <w:tc>
+          <w:tcPr/>
+          <w:p>
+            <w:pPr>
+              <w:pStyle w:val="Compact"/>
+              <w:jc w:val="right"/>
+            </w:pPr>
+            <w:r>
+              <w:t xml:space="preserve">No</w:t>
+            </w:r>
+          </w:p>
+        </w:tc>
+        <w:tc>
+          <w:tcPr/>
+          <w:p>
+            <w:pPr>
+              <w:pStyle w:val="Compact"/>
+              <w:jc w:val="right"/>
+            </w:pPr>
+            <w:r>
+              <w:t xml:space="preserve">Sometimes</w:t>
+            </w:r>
+          </w:p>
+        </w:tc>
+        <w:tc>
+          <w:tcPr/>
+          <w:p>
+            <w:pPr>
+              <w:pStyle w:val="Compact"/>
+              <w:jc w:val="right"/>
+            </w:pPr>
+            <w:r>
+              <w:t xml:space="preserve">No</w:t>
+            </w:r>
+          </w:p>
+        </w:tc>
+        <w:tc>
+          <w:tcPr/>
+          <w:p>
+            <w:pPr>
+              <w:pStyle w:val="Compact"/>
+              <w:jc w:val="right"/>
+            </w:pPr>
+            <w:r>
+              <w:t xml:space="preserve">No</w:t>
+            </w:r>
+          </w:p>
+        </w:tc>
+        <w:tc>
+          <w:tcPr/>
+          <w:p>
+            <w:pPr>
+              <w:pStyle w:val="Compact"/>
+              <w:jc w:val="right"/>
+            </w:pPr>
+            <w:r>
+              <w:t xml:space="preserve">Rare</w:t>
+            </w:r>
+          </w:p>
+        </w:tc>
+        <w:tc>
+          <w:tcPr/>
+          <w:p>
+            <w:pPr>
+              <w:pStyle w:val="Compact"/>
+              <w:jc w:val="right"/>
+            </w:pPr>
+            <w:r>
+              <w:t xml:space="preserve">Sometimes</w:t>
+            </w:r>
+          </w:p>
+        </w:tc>
+      </w:tr>
+      <w:tr>
+        <w:tc>
+          <w:tcPr/>
+          <w:p>
+            <w:pPr>
+              <w:pStyle w:val="Compact"/>
+            </w:pPr>
+            <w:r>
+              <w:t xml:space="preserve">GPS/GNSS spoofing detection</w:t>
+            </w:r>
+          </w:p>
+        </w:tc>
+        <w:tc>
+          <w:tcPr/>
+          <w:p>
+            <w:pPr>
+              <w:pStyle w:val="Compact"/>
+              <w:jc w:val="right"/>
+            </w:pPr>
+            <w:r>
+              <w:t xml:space="preserve">No</w:t>
+            </w:r>
+          </w:p>
+        </w:tc>
+        <w:tc>
+          <w:tcPr/>
+          <w:p>
+            <w:pPr>
+              <w:pStyle w:val="Compact"/>
+              <w:jc w:val="right"/>
+            </w:pPr>
+            <w:r>
+              <w:t xml:space="preserve">Yes</w:t>
+            </w:r>
+          </w:p>
+        </w:tc>
+        <w:tc>
+          <w:tcPr/>
+          <w:p>
+            <w:pPr>
+              <w:pStyle w:val="Compact"/>
+              <w:jc w:val="right"/>
+            </w:pPr>
+            <w:r>
+              <w:t xml:space="preserve">No</w:t>
+            </w:r>
+          </w:p>
+        </w:tc>
+        <w:tc>
+          <w:tcPr/>
+          <w:p>
+            <w:pPr>
+              <w:pStyle w:val="Compact"/>
+              <w:jc w:val="right"/>
+            </w:pPr>
+            <w:r>
+              <w:t xml:space="preserve">Sometimes</w:t>
+            </w:r>
+          </w:p>
+        </w:tc>
+        <w:tc>
+          <w:tcPr/>
+          <w:p>
+            <w:pPr>
+              <w:pStyle w:val="Compact"/>
+              <w:jc w:val="right"/>
+            </w:pPr>
+            <w:r>
+              <w:t xml:space="preserve">No</w:t>
+            </w:r>
+          </w:p>
+        </w:tc>
+        <w:tc>
+          <w:tcPr/>
+          <w:p>
+            <w:pPr>
+              <w:pStyle w:val="Compact"/>
+              <w:jc w:val="right"/>
+            </w:pPr>
+            <w:r>
+              <w:t xml:space="preserve">No</w:t>
+            </w:r>
+          </w:p>
+        </w:tc>
+        <w:tc>
+          <w:tcPr/>
+          <w:p>
+            <w:pPr>
+              <w:pStyle w:val="Compact"/>
+              <w:jc w:val="right"/>
+            </w:pPr>
+            <w:r>
+              <w:t xml:space="preserve">Rare</w:t>
+            </w:r>
+          </w:p>
+        </w:tc>
+        <w:tc>
+          <w:tcPr/>
+          <w:p>
+            <w:pPr>
+              <w:pStyle w:val="Compact"/>
+              <w:jc w:val="right"/>
+            </w:pPr>
+            <w:r>
+              <w:t xml:space="preserve">Rare</w:t>
+            </w:r>
+          </w:p>
+        </w:tc>
+      </w:tr>
+      <w:tr>
+        <w:tc>
+          <w:tcPr/>
+          <w:p>
+            <w:pPr>
+              <w:pStyle w:val="Compact"/>
+            </w:pPr>
+            <w:r>
+              <w:t xml:space="preserve">UAV intrusion detection systems</w:t>
+            </w:r>
+          </w:p>
+        </w:tc>
+        <w:tc>
+          <w:tcPr/>
+          <w:p>
+            <w:pPr>
+              <w:pStyle w:val="Compact"/>
+              <w:jc w:val="right"/>
+            </w:pPr>
+            <w:r>
+              <w:t xml:space="preserve">Sometimes</w:t>
+            </w:r>
+          </w:p>
+        </w:tc>
+        <w:tc>
+          <w:tcPr/>
+          <w:p>
+            <w:pPr>
+              <w:pStyle w:val="Compact"/>
+              <w:jc w:val="right"/>
+            </w:pPr>
+            <w:r>
+              <w:t xml:space="preserve">Sometimes</w:t>
+            </w:r>
+          </w:p>
+        </w:tc>
+        <w:tc>
+          <w:tcPr/>
+          <w:p>
+            <w:pPr>
+              <w:pStyle w:val="Compact"/>
+              <w:jc w:val="right"/>
+            </w:pPr>
+            <w:r>
+              <w:t xml:space="preserve">Sometimes</w:t>
+            </w:r>
+          </w:p>
+        </w:tc>
+        <w:tc>
+          <w:tcPr/>
+          <w:p>
+            <w:pPr>
+              <w:pStyle w:val="Compact"/>
+              <w:jc w:val="right"/>
+            </w:pPr>
+            <w:r>
+              <w:t xml:space="preserve">Sometimes</w:t>
+            </w:r>
+          </w:p>
+        </w:tc>
+        <w:tc>
+          <w:tcPr/>
+          <w:p>
+            <w:pPr>
+              <w:pStyle w:val="Compact"/>
+              <w:jc w:val="right"/>
+            </w:pPr>
+            <w:r>
+              <w:t xml:space="preserve">No</w:t>
+            </w:r>
+          </w:p>
+        </w:tc>
+        <w:tc>
+          <w:tcPr/>
+          <w:p>
+            <w:pPr>
+              <w:pStyle w:val="Compact"/>
+              <w:jc w:val="right"/>
+            </w:pPr>
+            <w:r>
+              <w:t xml:space="preserve">No</w:t>
+            </w:r>
+          </w:p>
+        </w:tc>
+        <w:tc>
+          <w:tcPr/>
+          <w:p>
+            <w:pPr>
+              <w:pStyle w:val="Compact"/>
+              <w:jc w:val="right"/>
+            </w:pPr>
+            <w:r>
+              <w:t xml:space="preserve">Sometimes</w:t>
+            </w:r>
+          </w:p>
+        </w:tc>
+        <w:tc>
+          <w:tcPr/>
+          <w:p>
+            <w:pPr>
+              <w:pStyle w:val="Compact"/>
+              <w:jc w:val="right"/>
+            </w:pPr>
+            <w:r>
+              <w:t xml:space="preserve">Rare</w:t>
+            </w:r>
+          </w:p>
+        </w:tc>
+      </w:tr>
+      <w:tr>
+        <w:tc>
+          <w:tcPr/>
+          <w:p>
+            <w:pPr>
+              <w:pStyle w:val="Compact"/>
+            </w:pPr>
+            <w:r>
+              <w:t xml:space="preserve">Blockchain-based UAV logging</w:t>
+            </w:r>
+          </w:p>
+        </w:tc>
+        <w:tc>
+          <w:tcPr/>
+          <w:p>
+            <w:pPr>
+              <w:pStyle w:val="Compact"/>
+              <w:jc w:val="right"/>
+            </w:pPr>
+            <w:r>
+              <w:t xml:space="preserve">No</w:t>
+            </w:r>
+          </w:p>
+        </w:tc>
+        <w:tc>
+          <w:tcPr/>
+          <w:p>
+            <w:pPr>
+              <w:pStyle w:val="Compact"/>
+              <w:jc w:val="right"/>
+            </w:pPr>
+            <w:r>
+              <w:t xml:space="preserve">No</w:t>
+            </w:r>
+          </w:p>
+        </w:tc>
+        <w:tc>
+          <w:tcPr/>
+          <w:p>
+            <w:pPr>
+              <w:pStyle w:val="Compact"/>
+              <w:jc w:val="right"/>
+            </w:pPr>
+            <w:r>
+              <w:t xml:space="preserve">Yes</w:t>
+            </w:r>
+          </w:p>
+        </w:tc>
+        <w:tc>
+          <w:tcPr/>
+          <w:p>
+            <w:pPr>
+              <w:pStyle w:val="Compact"/>
+              <w:jc w:val="right"/>
+            </w:pPr>
+            <w:r>
+              <w:t xml:space="preserve">No</w:t>
+            </w:r>
+          </w:p>
+        </w:tc>
+        <w:tc>
+          <w:tcPr/>
+          <w:p>
+            <w:pPr>
+              <w:pStyle w:val="Compact"/>
+              <w:jc w:val="right"/>
+            </w:pPr>
+            <w:r>
+              <w:t xml:space="preserve">No</w:t>
+            </w:r>
+          </w:p>
+        </w:tc>
+        <w:tc>
+          <w:tcPr/>
+          <w:p>
+            <w:pPr>
+              <w:pStyle w:val="Compact"/>
+              <w:jc w:val="right"/>
+            </w:pPr>
+            <w:r>
+              <w:t xml:space="preserve">No</w:t>
+            </w:r>
+          </w:p>
+        </w:tc>
+        <w:tc>
+          <w:tcPr/>
+          <w:p>
+            <w:pPr>
+              <w:pStyle w:val="Compact"/>
+              <w:jc w:val="right"/>
+            </w:pPr>
+            <w:r>
+              <w:t xml:space="preserve">Rare</w:t>
+            </w:r>
+          </w:p>
+        </w:tc>
+        <w:tc>
+          <w:tcPr/>
+          <w:p>
+            <w:pPr>
+              <w:pStyle w:val="Compact"/>
+              <w:jc w:val="right"/>
+            </w:pPr>
+            <w:r>
+              <w:t xml:space="preserve">Rare</w:t>
+            </w:r>
+          </w:p>
+        </w:tc>
+      </w:tr>
+      <w:tr>
+        <w:tc>
+          <w:tcPr/>
+          <w:p>
+            <w:pPr>
+              <w:pStyle w:val="Compact"/>
+            </w:pPr>
+            <w:r>
+              <w:t xml:space="preserve">UAV swarm task allocation</w:t>
+            </w:r>
+          </w:p>
+        </w:tc>
+        <w:tc>
+          <w:tcPr/>
+          <w:p>
+            <w:pPr>
+              <w:pStyle w:val="Compact"/>
+              <w:jc w:val="right"/>
+            </w:pPr>
+            <w:r>
+              <w:t xml:space="preserve">Sometimes</w:t>
+            </w:r>
+          </w:p>
+        </w:tc>
+        <w:tc>
+          <w:tcPr/>
+          <w:p>
+            <w:pPr>
+              <w:pStyle w:val="Compact"/>
+              <w:jc w:val="right"/>
+            </w:pPr>
+            <w:r>
+              <w:t xml:space="preserve">Sometimes</w:t>
+            </w:r>
+          </w:p>
+        </w:tc>
+        <w:tc>
+          <w:tcPr/>
+          <w:p>
+            <w:pPr>
+              <w:pStyle w:val="Compact"/>
+              <w:jc w:val="right"/>
+            </w:pPr>
+            <w:r>
+              <w:t xml:space="preserve">No</w:t>
+            </w:r>
+          </w:p>
+        </w:tc>
+        <w:tc>
+          <w:tcPr/>
+          <w:p>
+            <w:pPr>
+              <w:pStyle w:val="Compact"/>
+              <w:jc w:val="right"/>
+            </w:pPr>
+            <w:r>
+              <w:t xml:space="preserve">Sometimes</w:t>
+            </w:r>
+          </w:p>
+        </w:tc>
+        <w:tc>
+          <w:tcPr/>
+          <w:p>
+            <w:pPr>
+              <w:pStyle w:val="Compact"/>
+              <w:jc w:val="right"/>
+            </w:pPr>
+            <w:r>
+              <w:t xml:space="preserve">Partial</w:t>
+            </w:r>
+          </w:p>
+        </w:tc>
+        <w:tc>
+          <w:tcPr/>
+          <w:p>
+            <w:pPr>
+              <w:pStyle w:val="Compact"/>
+              <w:jc w:val="right"/>
+            </w:pPr>
+            <w:r>
+              <w:t xml:space="preserve">No</w:t>
+            </w:r>
+          </w:p>
+        </w:tc>
+        <w:tc>
+          <w:tcPr/>
+          <w:p>
+            <w:pPr>
+              <w:pStyle w:val="Compact"/>
+              <w:jc w:val="right"/>
+            </w:pPr>
+            <w:r>
+              <w:t xml:space="preserve">Sometimes</w:t>
+            </w:r>
+          </w:p>
+        </w:tc>
+        <w:tc>
+          <w:tcPr/>
+          <w:p>
+            <w:pPr>
+              <w:pStyle w:val="Compact"/>
+              <w:jc w:val="right"/>
+            </w:pPr>
+            <w:r>
+              <w:t xml:space="preserve">Yes</w:t>
+            </w:r>
+          </w:p>
+        </w:tc>
+      </w:tr>
+      <w:tr>
+        <w:tc>
+          <w:tcPr/>
+          <w:p>
+            <w:pPr>
+              <w:pStyle w:val="Compact"/>
+            </w:pPr>
+            <w:r>
+              <w:t xml:space="preserve">UAV swarm resilience models</w:t>
+            </w:r>
+          </w:p>
+        </w:tc>
+        <w:tc>
+          <w:tcPr/>
+          <w:p>
+            <w:pPr>
+              <w:pStyle w:val="Compact"/>
+              <w:jc w:val="right"/>
+            </w:pPr>
+            <w:r>
+              <w:t xml:space="preserve">Sometimes</w:t>
+            </w:r>
+          </w:p>
+        </w:tc>
+        <w:tc>
+          <w:tcPr/>
+          <w:p>
+            <w:pPr>
+              <w:pStyle w:val="Compact"/>
+              <w:jc w:val="right"/>
+            </w:pPr>
+            <w:r>
+              <w:t xml:space="preserve">Sometimes</w:t>
+            </w:r>
+          </w:p>
+        </w:tc>
+        <w:tc>
+          <w:tcPr/>
+          <w:p>
+            <w:pPr>
+              <w:pStyle w:val="Compact"/>
+              <w:jc w:val="right"/>
+            </w:pPr>
+            <w:r>
+              <w:t xml:space="preserve">Rare</w:t>
+            </w:r>
+          </w:p>
+        </w:tc>
+        <w:tc>
+          <w:tcPr/>
+          <w:p>
+            <w:pPr>
+              <w:pStyle w:val="Compact"/>
+              <w:jc w:val="right"/>
+            </w:pPr>
+            <w:r>
+              <w:t xml:space="preserve">No</w:t>
+            </w:r>
+          </w:p>
+        </w:tc>
+        <w:tc>
+          <w:tcPr/>
+          <w:p>
+            <w:pPr>
+              <w:pStyle w:val="Compact"/>
+              <w:jc w:val="right"/>
+            </w:pPr>
+            <w:r>
+              <w:t xml:space="preserve">Partial</w:t>
+            </w:r>
+          </w:p>
+        </w:tc>
+        <w:tc>
+          <w:tcPr/>
+          <w:p>
+            <w:pPr>
+              <w:pStyle w:val="Compact"/>
+              <w:jc w:val="right"/>
+            </w:pPr>
+            <w:r>
+              <w:t xml:space="preserve">Rare</w:t>
+            </w:r>
+          </w:p>
+        </w:tc>
+        <w:tc>
+          <w:tcPr/>
+          <w:p>
+            <w:pPr>
+              <w:pStyle w:val="Compact"/>
+              <w:jc w:val="right"/>
+            </w:pPr>
+            <w:r>
+              <w:t xml:space="preserve">Sometimes</w:t>
+            </w:r>
+          </w:p>
+        </w:tc>
+        <w:tc>
+          <w:tcPr/>
+          <w:p>
+            <w:pPr>
+              <w:pStyle w:val="Compact"/>
+              <w:jc w:val="right"/>
+            </w:pPr>
+            <w:r>
+              <w:t xml:space="preserve">Sometimes</w:t>
+            </w:r>
+          </w:p>
+        </w:tc>
+      </w:tr>
+      <w:tr>
+        <w:tc>
+          <w:tcPr/>
+          <w:p>
+            <w:pPr>
+              <w:pStyle w:val="Compact"/>
+            </w:pPr>
+            <w:r>
+              <w:rPr>
+                <w:b/>
+                <w:bCs/>
+              </w:rPr>
+              <w:t xml:space="preserve">RA-MARS v3</w:t>
+            </w:r>
+          </w:p>
+        </w:tc>
+        <w:tc>
+          <w:tcPr/>
+          <w:p>
+            <w:pPr>
+              <w:pStyle w:val="Compact"/>
+              <w:jc w:val="right"/>
+            </w:pPr>
+            <w:r>
+              <w:rPr>
+                <w:b/>
+                <w:bCs/>
+              </w:rPr>
+              <w:t xml:space="preserve">Yes</w:t>
+            </w:r>
+          </w:p>
+        </w:tc>
+        <w:tc>
+          <w:tcPr/>
+          <w:p>
+            <w:pPr>
+              <w:pStyle w:val="Compact"/>
+              <w:jc w:val="right"/>
+            </w:pPr>
+            <w:r>
+              <w:rPr>
+                <w:b/>
+                <w:bCs/>
+              </w:rPr>
+              <w:t xml:space="preserve">Yes</w:t>
+            </w:r>
+          </w:p>
+        </w:tc>
+        <w:tc>
+          <w:tcPr/>
+          <w:p>
+            <w:pPr>
+              <w:pStyle w:val="Compact"/>
+              <w:jc w:val="right"/>
+            </w:pPr>
+            <w:r>
+              <w:rPr>
+                <w:b/>
+                <w:bCs/>
+              </w:rPr>
+              <w:t xml:space="preserve">Yes</w:t>
+            </w:r>
+          </w:p>
+        </w:tc>
+        <w:tc>
+          <w:tcPr/>
+          <w:p>
+            <w:pPr>
+              <w:pStyle w:val="Compact"/>
+              <w:jc w:val="right"/>
+            </w:pPr>
+            <w:r>
+              <w:rPr>
+                <w:b/>
+                <w:bCs/>
+              </w:rPr>
+              <w:t xml:space="preserve">Yes</w:t>
+            </w:r>
+          </w:p>
+        </w:tc>
+        <w:tc>
+          <w:tcPr/>
+          <w:p>
+            <w:pPr>
+              <w:pStyle w:val="Compact"/>
+              <w:jc w:val="right"/>
+            </w:pPr>
+            <w:r>
+              <w:rPr>
+                <w:b/>
+                <w:bCs/>
+              </w:rPr>
+              <w:t xml:space="preserve">Yes</w:t>
+            </w:r>
+          </w:p>
+        </w:tc>
+        <w:tc>
+          <w:tcPr/>
+          <w:p>
+            <w:pPr>
+              <w:pStyle w:val="Compact"/>
+              <w:jc w:val="right"/>
+            </w:pPr>
+            <w:r>
+              <w:rPr>
+                <w:b/>
+                <w:bCs/>
+              </w:rPr>
+              <w:t xml:space="preserve">Yes</w:t>
+            </w:r>
+          </w:p>
+        </w:tc>
+        <w:tc>
+          <w:tcPr/>
+          <w:p>
+            <w:pPr>
+              <w:pStyle w:val="Compact"/>
+              <w:jc w:val="right"/>
+            </w:pPr>
+            <w:r>
+              <w:rPr>
+                <w:b/>
+                <w:bCs/>
+              </w:rPr>
+              <w:t xml:space="preserve">Yes</w:t>
+            </w:r>
+          </w:p>
+        </w:tc>
+        <w:tc>
+          <w:tcPr/>
+          <w:p>
+            <w:pPr>
+              <w:pStyle w:val="Compact"/>
+              <w:jc w:val="right"/>
+            </w:pPr>
+            <w:r>
+              <w:rPr>
+                <w:b/>
+                <w:bCs/>
+              </w:rPr>
+              <w:t xml:space="preserve">Yes</w:t>
+            </w:r>
+          </w:p>
+        </w:tc>
+      </w:tr>
+    </w:tbl>
+    <w:bookmarkEnd w:id="84"/>
+    <w:bookmarkEnd w:id="85"/>
+    <w:bookmarkStart w:id="86" w:name="manuscript-use"/>
+    <w:p>
+      <w:pPr>
+        <w:pStyle w:val="Heading2"/>
+      </w:pPr>
+      <w:r>
+        <w:t xml:space="preserve">Manuscript Use</w:t>
       </w:r>
     </w:p>
     <w:p>
@@ -5744,65 +6528,17 @@
         <w:pStyle w:val="FirstParagraph"/>
       </w:pPr>
       <w:r>
-        <w:t xml:space="preserve">Although RA-MARS is designed to improve mission assurance for multi-UAV defence surveillance under contested conditions, this study has several limitations.</w:t>
-      </w:r>
-    </w:p>
-    <w:p>
-      <w:pPr>
-        <w:pStyle w:val="BodyText"/>
-      </w:pPr>
-      <w:r>
-        <w:t xml:space="preserve">First, the evaluation is simulation-based. The UAV telemetry data, attack events, mission-zone coverage, and adversarial conditions are generated through controlled simulation. Therefore, the results should be interpreted as simulation-based evidence rather than real-world flight validation.</w:t>
-      </w:r>
-    </w:p>
-    <w:p>
-      <w:pPr>
-        <w:pStyle w:val="BodyText"/>
-      </w:pPr>
-      <w:r>
-        <w:t xml:space="preserve">Second, the attack models are simplified representations of RF jamming, GPS/GNSS spoofing, and mission-data tampering. Real contested environments may involve more complex electromagnetic interference, adaptive jammers, multipath effects, stealthy spoofing strategies, insider threats, malware, and coordinated adversarial behavior.</w:t>
-      </w:r>
-    </w:p>
-    <w:p>
-      <w:pPr>
-        <w:pStyle w:val="BodyText"/>
-      </w:pPr>
-      <w:r>
-        <w:t xml:space="preserve">Third, the proposed tamper-resistant logging module is modeled using a lightweight hash-chain or blockchain-inspired structure. While this approach supports mission-record integrity verification, the study does not claim full-scale deployment of a production blockchain network in operational defence UAV systems.</w:t>
-      </w:r>
-    </w:p>
-    <w:p>
-      <w:pPr>
-        <w:pStyle w:val="BodyText"/>
-      </w:pPr>
-      <w:r>
-        <w:t xml:space="preserve">Fourth, the simulation does not include physical UAV capture, hardware compromise, firmware-level malware, classified defence communication protocols, or real electronic warfare hardware. These factors may significantly affect system performance in real operational environments.</w:t>
-      </w:r>
-    </w:p>
-    <w:p>
-      <w:pPr>
-        <w:pStyle w:val="BodyText"/>
-      </w:pPr>
-      <w:r>
-        <w:t xml:space="preserve">Fifth, the proposed AI-based detection module depends on the quality and representativeness of the generated telemetry and attack data. Real-world attack patterns may differ from the synthetic scenarios used in this study.</w:t>
-      </w:r>
-    </w:p>
-    <w:p>
-      <w:pPr>
-        <w:pStyle w:val="BodyText"/>
-      </w:pPr>
-      <w:r>
-        <w:t xml:space="preserve">Finally, the framework focuses on mission assurance for surveillance-oriented multi-UAV operations. Additional validation would be required before applying the framework to other defence missions such as strike coordination, logistics, electronic attack, or manned-unmanned teaming.</w:t>
-      </w:r>
-    </w:p>
-    <w:bookmarkEnd w:id="91"/>
-    <w:bookmarkStart w:id="92" w:name="future-work"/>
+        <w:t xml:space="preserve">This table should be inserted near the end of the Related Work section or at the beginning of the Research Gap section.</w:t>
+      </w:r>
+    </w:p>
+    <w:bookmarkEnd w:id="86"/>
+    <w:bookmarkStart w:id="87" w:name="main-novelty-message"/>
     <w:p>
       <w:pPr>
         <w:pStyle w:val="Heading2"/>
       </w:pPr>
       <w:r>
-        <w:t xml:space="preserve">Future Work</w:t>
+        <w:t xml:space="preserve">Main Novelty Message</w:t>
       </w:r>
     </w:p>
     <w:p>
@@ -5810,55 +6546,7 @@
         <w:pStyle w:val="FirstParagraph"/>
       </w:pPr>
       <w:r>
-        <w:t xml:space="preserve">Future work may extend RA-MARS in several directions.</w:t>
-      </w:r>
-    </w:p>
-    <w:p>
-      <w:pPr>
-        <w:pStyle w:val="BodyText"/>
-      </w:pPr>
-      <w:r>
-        <w:t xml:space="preserve">First, hardware-in-the-loop and real UAV flight experiments can be conducted to validate the framework under more realistic communication, navigation, and mission-control conditions.</w:t>
-      </w:r>
-    </w:p>
-    <w:p>
-      <w:pPr>
-        <w:pStyle w:val="BodyText"/>
-      </w:pPr>
-      <w:r>
-        <w:t xml:space="preserve">Second, future studies can incorporate more advanced adversarial models, including adaptive jamming, coordinated spoofing, adversarial machine learning attacks, malware-based telemetry manipulation, and insider threats.</w:t>
-      </w:r>
-    </w:p>
-    <w:p>
-      <w:pPr>
-        <w:pStyle w:val="BodyText"/>
-      </w:pPr>
-      <w:r>
-        <w:t xml:space="preserve">Third, the tamper-resistant logging module can be extended using lightweight distributed ledger architectures optimized for resource-constrained UAV swarms.</w:t>
-      </w:r>
-    </w:p>
-    <w:p>
-      <w:pPr>
-        <w:pStyle w:val="BodyText"/>
-      </w:pPr>
-      <w:r>
-        <w:t xml:space="preserve">Fourth, RA-MARS can be evaluated with larger swarm sizes, heterogeneous UAV platforms, and cross-domain autonomous systems involving air, ground, and maritime agents.</w:t>
-      </w:r>
-    </w:p>
-    <w:p>
-      <w:pPr>
-        <w:pStyle w:val="BodyText"/>
-      </w:pPr>
-      <w:r>
-        <w:t xml:space="preserve">Fifth, the AI detection module can be improved using federated learning, online learning, continual learning, and uncertainty-aware models to support adaptation under changing mission environments.</w:t>
-      </w:r>
-    </w:p>
-    <w:p>
-      <w:pPr>
-        <w:pStyle w:val="BodyText"/>
-      </w:pPr>
-      <w:r>
-        <w:t xml:space="preserve">Finally, future work can investigate human-machine teaming interfaces that allow operators to interpret RA-MARS risk scores, mission alerts, and adaptive response recommendations in real time.</w:t>
+        <w:t xml:space="preserve">RA-MARS v3 differs from prior work by connecting cyber-electromagnetic attack detection, Mission Assurance Index scoring, digital twin action selection, adaptive mission continuation, and tamper-resistant mission provenance in a single mission-level framework.</w:t>
       </w:r>
     </w:p>
     <w:p>
@@ -5868,15 +6556,15 @@
         </w:pict>
       </w:r>
     </w:p>
-    <w:bookmarkEnd w:id="92"/>
-    <w:bookmarkEnd w:id="93"/>
-    <w:bookmarkStart w:id="94" w:name="conclusion"/>
+    <w:bookmarkEnd w:id="87"/>
+    <w:bookmarkEnd w:id="88"/>
+    <w:bookmarkStart w:id="93" w:name="X7222a93729f4417ef0358d358f52de5a9e4cda1"/>
     <w:p>
       <w:pPr>
         <w:pStyle w:val="Heading1"/>
       </w:pPr>
       <w:r>
-        <w:t xml:space="preserve">Conclusion</w:t>
+        <w:t xml:space="preserve">Leakage Prevention and Reproducibility Controls</w:t>
       </w:r>
     </w:p>
     <w:p>
@@ -5884,47 +6572,263 @@
         <w:pStyle w:val="FirstParagraph"/>
       </w:pPr>
       <w:r>
-        <w:t xml:space="preserve">This paper proposed RA-MARS, a cross-layer mission assurance digital twin for secure multi-UAV defence surveillance under cyber-electromagnetic and navigation attacks. The framework addresses radio-frequency jamming, GPS/GNSS spoofing, mission-data tampering, and combined attacks by linking temporal attack detection, Mission Assurance Index scoring, digital twin-based action selection, adaptive mission continuation, and tamper-resistant mission provenance.</w:t>
-      </w:r>
-    </w:p>
-    <w:p>
-      <w:pPr>
-        <w:pStyle w:val="BodyText"/>
-      </w:pPr>
-      <w:r>
-        <w:t xml:space="preserve">Unlike isolated UAV security approaches that focus only on attack detection, anti-jamming communication, navigation trust, task allocation, or secure logging, RA-MARS evaluates resilience at the mission level. The framework is designed to support mission continuity by converting raw telemetry, communication, navigation, energy, and mission-progress indicators into operational assurance decisions.</w:t>
-      </w:r>
-    </w:p>
-    <w:p>
-      <w:pPr>
-        <w:pStyle w:val="BodyText"/>
-      </w:pPr>
-      <w:r>
-        <w:t xml:space="preserve">The optimized v3 evaluation used synthetic multi-UAV telemetry data with 90,000 sequence-safe telemetry rows and 16,875 time-series windows. Each window contained 20 telemetry steps and 9 raw non-leakage features per step. Derived Mission Assurance Index and component scores were excluded from classifier inputs to avoid feature leakage. Across eight mission-state classes, the best macro-F1 model, Weighted LSTM, achieved 75.25% accuracy, 58.10% macro precision, 60.91% macro recall, 57.02% macro F1-score, and 74.83% weighted F1-score. The Random Forest classical baseline achieved 77.06% accuracy and 56.56% macro F1-score.</w:t>
-      </w:r>
-    </w:p>
-    <w:p>
-      <w:pPr>
-        <w:pStyle w:val="BodyText"/>
-      </w:pPr>
-      <w:r>
-        <w:t xml:space="preserve">At the mission level, full RA-MARS achieved a Mission Assurance Index of 0.7291 ± 0.0057 and a mission success rate of 78.25 ± 0.46% under stressed attack scenarios. The ablation study showed that removing adaptive continuation reduced mission success to 61.82%, removing the Mission Assurance Index reduced it to 65.73%, and removing digital twin action selection reduced it to 66.51%. Scalability results showed that mission success remained stable across 10, 20, and 30 UAV swarms, while attack-intensity analysis showed an expected reduction in mission success from low-intensity to high-intensity attacks.</w:t>
-      </w:r>
-    </w:p>
-    <w:p>
-      <w:pPr>
-        <w:pStyle w:val="BodyText"/>
-      </w:pPr>
-      <w:r>
-        <w:t xml:space="preserve">These results support the central claim that multi-UAV resilience should be evaluated using mission-assurance metrics rather than attack-classification accuracy alone. Detection is necessary but not sufficient for defence surveillance missions. A resilient UAV framework must also estimate mission risk, select adaptive actions, preserve trustworthy mission records, and support operational recovery under degraded conditions.</w:t>
-      </w:r>
-    </w:p>
-    <w:p>
-      <w:pPr>
-        <w:pStyle w:val="BodyText"/>
-      </w:pPr>
-      <w:r>
-        <w:t xml:space="preserve">This study has limitations. The evaluation is based on synthetic simulation data and does not represent real military UAV flight data, classified operational systems, or deployed battlefield validation. The attack models are controlled abstractions of jamming, spoofing, tampering, and combined attacks. Future work should include hardware-in-the-loop validation, real UAV flight experiments, more detailed RF and GNSS channel modeling, human-machine teaming interfaces, adversarial learning, and operational field testing.</w:t>
+        <w:t xml:space="preserve">To improve scientific validity, the v3 attack-detection experiment uses only raw non-leakage input features. Derived Mission Assurance Index values and derived component scores are excluded from classifier input. The purpose of this design choice is to prevent the model from learning labels indirectly from post-processed risk or assurance scores.</w:t>
+      </w:r>
+    </w:p>
+    <w:p>
+      <w:pPr>
+        <w:pStyle w:val="BodyText"/>
+      </w:pPr>
+      <w:r>
+        <w:t xml:space="preserve">The v3 classifier input includes only the following raw telemetry, communication, navigation, energy, and mission-progress features:</w:t>
+      </w:r>
+    </w:p>
+    <w:p>
+      <w:pPr>
+        <w:pStyle w:val="Compact"/>
+        <w:numPr>
+          <w:ilvl w:val="0"/>
+          <w:numId w:val="1033"/>
+        </w:numPr>
+      </w:pPr>
+      <w:r>
+        <w:t xml:space="preserve">packet loss rate</w:t>
+      </w:r>
+    </w:p>
+    <w:p>
+      <w:pPr>
+        <w:pStyle w:val="Compact"/>
+        <w:numPr>
+          <w:ilvl w:val="0"/>
+          <w:numId w:val="1033"/>
+        </w:numPr>
+      </w:pPr>
+      <w:r>
+        <w:t xml:space="preserve">communication latency</w:t>
+      </w:r>
+    </w:p>
+    <w:p>
+      <w:pPr>
+        <w:pStyle w:val="Compact"/>
+        <w:numPr>
+          <w:ilvl w:val="0"/>
+          <w:numId w:val="1033"/>
+        </w:numPr>
+      </w:pPr>
+      <w:r>
+        <w:t xml:space="preserve">route deviation</w:t>
+      </w:r>
+    </w:p>
+    <w:p>
+      <w:pPr>
+        <w:pStyle w:val="Compact"/>
+        <w:numPr>
+          <w:ilvl w:val="0"/>
+          <w:numId w:val="1033"/>
+        </w:numPr>
+      </w:pPr>
+      <w:r>
+        <w:t xml:space="preserve">GPS jump</w:t>
+      </w:r>
+    </w:p>
+    <w:p>
+      <w:pPr>
+        <w:pStyle w:val="Compact"/>
+        <w:numPr>
+          <w:ilvl w:val="0"/>
+          <w:numId w:val="1033"/>
+        </w:numPr>
+      </w:pPr>
+      <w:r>
+        <w:t xml:space="preserve">velocity inconsistency</w:t>
+      </w:r>
+    </w:p>
+    <w:p>
+      <w:pPr>
+        <w:pStyle w:val="Compact"/>
+        <w:numPr>
+          <w:ilvl w:val="0"/>
+          <w:numId w:val="1033"/>
+        </w:numPr>
+      </w:pPr>
+      <w:r>
+        <w:t xml:space="preserve">battery level</w:t>
+      </w:r>
+    </w:p>
+    <w:p>
+      <w:pPr>
+        <w:pStyle w:val="Compact"/>
+        <w:numPr>
+          <w:ilvl w:val="0"/>
+          <w:numId w:val="1033"/>
+        </w:numPr>
+      </w:pPr>
+      <w:r>
+        <w:t xml:space="preserve">mission progress</w:t>
+      </w:r>
+    </w:p>
+    <w:p>
+      <w:pPr>
+        <w:pStyle w:val="Compact"/>
+        <w:numPr>
+          <w:ilvl w:val="0"/>
+          <w:numId w:val="1033"/>
+        </w:numPr>
+      </w:pPr>
+      <w:r>
+        <w:t xml:space="preserve">zone coverage</w:t>
+      </w:r>
+    </w:p>
+    <w:p>
+      <w:pPr>
+        <w:pStyle w:val="Compact"/>
+        <w:numPr>
+          <w:ilvl w:val="0"/>
+          <w:numId w:val="1033"/>
+        </w:numPr>
+      </w:pPr>
+      <w:r>
+        <w:t xml:space="preserve">energy consumption</w:t>
+      </w:r>
+    </w:p>
+    <w:p>
+      <w:pPr>
+        <w:pStyle w:val="FirstParagraph"/>
+      </w:pPr>
+      <w:r>
+        <w:t xml:space="preserve">The following derived features are not used as classifier inputs:</w:t>
+      </w:r>
+    </w:p>
+    <w:p>
+      <w:pPr>
+        <w:pStyle w:val="Compact"/>
+        <w:numPr>
+          <w:ilvl w:val="0"/>
+          <w:numId w:val="1034"/>
+        </w:numPr>
+      </w:pPr>
+      <w:r>
+        <w:t xml:space="preserve">Mission Assurance Index</w:t>
+      </w:r>
+    </w:p>
+    <w:p>
+      <w:pPr>
+        <w:pStyle w:val="Compact"/>
+        <w:numPr>
+          <w:ilvl w:val="0"/>
+          <w:numId w:val="1034"/>
+        </w:numPr>
+      </w:pPr>
+      <w:r>
+        <w:t xml:space="preserve">communication score</w:t>
+      </w:r>
+    </w:p>
+    <w:p>
+      <w:pPr>
+        <w:pStyle w:val="Compact"/>
+        <w:numPr>
+          <w:ilvl w:val="0"/>
+          <w:numId w:val="1034"/>
+        </w:numPr>
+      </w:pPr>
+      <w:r>
+        <w:t xml:space="preserve">navigation score</w:t>
+      </w:r>
+    </w:p>
+    <w:p>
+      <w:pPr>
+        <w:pStyle w:val="Compact"/>
+        <w:numPr>
+          <w:ilvl w:val="0"/>
+          <w:numId w:val="1034"/>
+        </w:numPr>
+      </w:pPr>
+      <w:r>
+        <w:t xml:space="preserve">coverage score</w:t>
+      </w:r>
+    </w:p>
+    <w:p>
+      <w:pPr>
+        <w:pStyle w:val="Compact"/>
+        <w:numPr>
+          <w:ilvl w:val="0"/>
+          <w:numId w:val="1034"/>
+        </w:numPr>
+      </w:pPr>
+      <w:r>
+        <w:t xml:space="preserve">integrity score</w:t>
+      </w:r>
+    </w:p>
+    <w:p>
+      <w:pPr>
+        <w:pStyle w:val="Compact"/>
+        <w:numPr>
+          <w:ilvl w:val="0"/>
+          <w:numId w:val="1034"/>
+        </w:numPr>
+      </w:pPr>
+      <w:r>
+        <w:t xml:space="preserve">recovery score</w:t>
+      </w:r>
+    </w:p>
+    <w:p>
+      <w:pPr>
+        <w:pStyle w:val="Compact"/>
+        <w:numPr>
+          <w:ilvl w:val="0"/>
+          <w:numId w:val="1034"/>
+        </w:numPr>
+      </w:pPr>
+      <w:r>
+        <w:t xml:space="preserve">risk level</w:t>
+      </w:r>
+    </w:p>
+    <w:p>
+      <w:pPr>
+        <w:pStyle w:val="Compact"/>
+        <w:numPr>
+          <w:ilvl w:val="0"/>
+          <w:numId w:val="1034"/>
+        </w:numPr>
+      </w:pPr>
+      <w:r>
+        <w:t xml:space="preserve">adaptive action</w:t>
+      </w:r>
+    </w:p>
+    <w:p>
+      <w:pPr>
+        <w:pStyle w:val="Compact"/>
+        <w:numPr>
+          <w:ilvl w:val="0"/>
+          <w:numId w:val="1034"/>
+        </w:numPr>
+      </w:pPr>
+      <w:r>
+        <w:t xml:space="preserve">projected mission assurance</w:t>
+      </w:r>
+    </w:p>
+    <w:p>
+      <w:pPr>
+        <w:pStyle w:val="FirstParagraph"/>
+      </w:pPr>
+      <w:r>
+        <w:t xml:space="preserve">The Mission Assurance Index is used only for mission-level evaluation and digital twin decision analysis, not for attack classification. This separation ensures that the attack-detection task remains more realistic and avoids artificial performance inflation.</w:t>
+      </w:r>
+    </w:p>
+    <w:p>
+      <w:pPr>
+        <w:pStyle w:val="BodyText"/>
+      </w:pPr>
+      <w:r>
+        <w:t xml:space="preserve">The v3 dataset uses sequence-safe sampling, where complete UAV time-series groups are preserved before creating 20-step telemetry windows. This prevents broken or randomly scattered windows and supports temporal attack-detection analysis. Fixed random seeds are used for reproducibility. The train/test split is stratified by class labels to preserve class distribution across model evaluation.</w:t>
+      </w:r>
+    </w:p>
+    <w:p>
+      <w:pPr>
+        <w:pStyle w:val="BodyText"/>
+      </w:pPr>
+      <w:r>
+        <w:t xml:space="preserve">All v3 results are based on synthetic simulation data and should be interpreted as simulation-based evidence. The results do not represent real military UAV flight validation, classified operational data, or deployed battlefield testing.</w:t>
       </w:r>
     </w:p>
     <w:p>
@@ -5934,13 +6838,792 @@
         </w:pict>
       </w:r>
     </w:p>
+    <w:bookmarkStart w:id="90" w:name="v3-digital-twin-action-selection-example"/>
+    <w:p>
+      <w:pPr>
+        <w:pStyle w:val="Heading2"/>
+      </w:pPr>
+      <w:r>
+        <w:t xml:space="preserve">v3 Digital Twin Action Selection Example</w:t>
+      </w:r>
+    </w:p>
+    <w:bookmarkStart w:id="89" w:name="X92c92087f7a92c91f0f0dee7311d9d9655bfaf5"/>
+    <w:p>
+      <w:pPr>
+        <w:pStyle w:val="Heading3"/>
+      </w:pPr>
+      <w:r>
+        <w:t xml:space="preserve">Table: Digital Twin Candidate Action Selection Example</w:t>
+      </w:r>
+    </w:p>
+    <w:tbl>
+      <w:tblPr>
+        <w:tblStyle w:val="Table"/>
+        <w:tblW w:type="pct" w:w="5000"/>
+        <w:tblLayout w:type="fixed"/>
+        <w:tblLook w:firstRow="1" w:lastRow="0" w:firstColumn="0" w:lastColumn="0" w:noHBand="0" w:noVBand="0" w:val="0020"/>
+      </w:tblPr>
+      <w:tblGrid>
+        <w:gridCol w:w="1827"/>
+        <w:gridCol w:w="1827"/>
+        <w:gridCol w:w="2436"/>
+        <w:gridCol w:w="1827"/>
+      </w:tblGrid>
+      <w:tr>
+        <w:trPr>
+          <w:tblHeader w:val="on"/>
+        </w:trPr>
+        <w:tc>
+          <w:tcPr/>
+          <w:p>
+            <w:pPr>
+              <w:pStyle w:val="Compact"/>
+            </w:pPr>
+            <w:r>
+              <w:t xml:space="preserve">Candidate Action</w:t>
+            </w:r>
+          </w:p>
+        </w:tc>
+        <w:tc>
+          <w:tcPr/>
+          <w:p>
+            <w:pPr>
+              <w:pStyle w:val="Compact"/>
+            </w:pPr>
+            <w:r>
+              <w:t xml:space="preserve">Operational Meaning</w:t>
+            </w:r>
+          </w:p>
+        </w:tc>
+        <w:tc>
+          <w:tcPr/>
+          <w:p>
+            <w:pPr>
+              <w:pStyle w:val="Compact"/>
+              <w:jc w:val="right"/>
+            </w:pPr>
+            <w:r>
+              <w:t xml:space="preserve">Projected Mission Assurance</w:t>
+            </w:r>
+          </w:p>
+        </w:tc>
+        <w:tc>
+          <w:tcPr/>
+          <w:p>
+            <w:pPr>
+              <w:pStyle w:val="Compact"/>
+            </w:pPr>
+            <w:r>
+              <w:t xml:space="preserve">Expected Effect</w:t>
+            </w:r>
+          </w:p>
+        </w:tc>
+      </w:tr>
+      <w:tr>
+        <w:tc>
+          <w:tcPr/>
+          <w:p>
+            <w:pPr>
+              <w:pStyle w:val="Compact"/>
+            </w:pPr>
+            <w:r>
+              <w:t xml:space="preserve">Continue</w:t>
+            </w:r>
+          </w:p>
+        </w:tc>
+        <w:tc>
+          <w:tcPr/>
+          <w:p>
+            <w:pPr>
+              <w:pStyle w:val="Compact"/>
+            </w:pPr>
+            <w:r>
+              <w:t xml:space="preserve">Continue current mission without intervention</w:t>
+            </w:r>
+          </w:p>
+        </w:tc>
+        <w:tc>
+          <w:tcPr/>
+          <w:p>
+            <w:pPr>
+              <w:pStyle w:val="Compact"/>
+              <w:jc w:val="right"/>
+            </w:pPr>
+            <w:r>
+              <w:t xml:space="preserve">0.58</w:t>
+            </w:r>
+          </w:p>
+        </w:tc>
+        <w:tc>
+          <w:tcPr/>
+          <w:p>
+            <w:pPr>
+              <w:pStyle w:val="Compact"/>
+            </w:pPr>
+            <w:r>
+              <w:t xml:space="preserve">Lowest overhead but higher exposure to attack effects</w:t>
+            </w:r>
+          </w:p>
+        </w:tc>
+      </w:tr>
+      <w:tr>
+        <w:tc>
+          <w:tcPr/>
+          <w:p>
+            <w:pPr>
+              <w:pStyle w:val="Compact"/>
+            </w:pPr>
+            <w:r>
+              <w:t xml:space="preserve">Monitor</w:t>
+            </w:r>
+          </w:p>
+        </w:tc>
+        <w:tc>
+          <w:tcPr/>
+          <w:p>
+            <w:pPr>
+              <w:pStyle w:val="Compact"/>
+            </w:pPr>
+            <w:r>
+              <w:t xml:space="preserve">Continue mission with increased monitoring</w:t>
+            </w:r>
+          </w:p>
+        </w:tc>
+        <w:tc>
+          <w:tcPr/>
+          <w:p>
+            <w:pPr>
+              <w:pStyle w:val="Compact"/>
+              <w:jc w:val="right"/>
+            </w:pPr>
+            <w:r>
+              <w:t xml:space="preserve">0.62</w:t>
+            </w:r>
+          </w:p>
+        </w:tc>
+        <w:tc>
+          <w:tcPr/>
+          <w:p>
+            <w:pPr>
+              <w:pStyle w:val="Compact"/>
+            </w:pPr>
+            <w:r>
+              <w:t xml:space="preserve">Improves awareness but limited recovery impact</w:t>
+            </w:r>
+          </w:p>
+        </w:tc>
+      </w:tr>
+      <w:tr>
+        <w:tc>
+          <w:tcPr/>
+          <w:p>
+            <w:pPr>
+              <w:pStyle w:val="Compact"/>
+            </w:pPr>
+            <w:r>
+              <w:t xml:space="preserve">Reroute</w:t>
+            </w:r>
+          </w:p>
+        </w:tc>
+        <w:tc>
+          <w:tcPr/>
+          <w:p>
+            <w:pPr>
+              <w:pStyle w:val="Compact"/>
+            </w:pPr>
+            <w:r>
+              <w:t xml:space="preserve">Modify UAV path to reduce navigation or communication risk</w:t>
+            </w:r>
+          </w:p>
+        </w:tc>
+        <w:tc>
+          <w:tcPr/>
+          <w:p>
+            <w:pPr>
+              <w:pStyle w:val="Compact"/>
+              <w:jc w:val="right"/>
+            </w:pPr>
+            <w:r>
+              <w:t xml:space="preserve">0.71</w:t>
+            </w:r>
+          </w:p>
+        </w:tc>
+        <w:tc>
+          <w:tcPr/>
+          <w:p>
+            <w:pPr>
+              <w:pStyle w:val="Compact"/>
+            </w:pPr>
+            <w:r>
+              <w:t xml:space="preserve">Reduces route deviation and avoids degraded areas</w:t>
+            </w:r>
+          </w:p>
+        </w:tc>
+      </w:tr>
+      <w:tr>
+        <w:tc>
+          <w:tcPr/>
+          <w:p>
+            <w:pPr>
+              <w:pStyle w:val="Compact"/>
+            </w:pPr>
+            <w:r>
+              <w:t xml:space="preserve">Reassign</w:t>
+            </w:r>
+          </w:p>
+        </w:tc>
+        <w:tc>
+          <w:tcPr/>
+          <w:p>
+            <w:pPr>
+              <w:pStyle w:val="Compact"/>
+            </w:pPr>
+            <w:r>
+              <w:t xml:space="preserve">Transfer mission-zone responsibility to healthier UAVs</w:t>
+            </w:r>
+          </w:p>
+        </w:tc>
+        <w:tc>
+          <w:tcPr/>
+          <w:p>
+            <w:pPr>
+              <w:pStyle w:val="Compact"/>
+              <w:jc w:val="right"/>
+            </w:pPr>
+            <w:r>
+              <w:t xml:space="preserve">0.78</w:t>
+            </w:r>
+          </w:p>
+        </w:tc>
+        <w:tc>
+          <w:tcPr/>
+          <w:p>
+            <w:pPr>
+              <w:pStyle w:val="Compact"/>
+            </w:pPr>
+            <w:r>
+              <w:t xml:space="preserve">Highest projected mission assurance in this example</w:t>
+            </w:r>
+          </w:p>
+        </w:tc>
+      </w:tr>
+      <w:tr>
+        <w:tc>
+          <w:tcPr/>
+          <w:p>
+            <w:pPr>
+              <w:pStyle w:val="Compact"/>
+            </w:pPr>
+            <w:r>
+              <w:t xml:space="preserve">Isolate Node</w:t>
+            </w:r>
+          </w:p>
+        </w:tc>
+        <w:tc>
+          <w:tcPr/>
+          <w:p>
+            <w:pPr>
+              <w:pStyle w:val="Compact"/>
+            </w:pPr>
+            <w:r>
+              <w:t xml:space="preserve">Remove suspected compromised UAV from mission coordination</w:t>
+            </w:r>
+          </w:p>
+        </w:tc>
+        <w:tc>
+          <w:tcPr/>
+          <w:p>
+            <w:pPr>
+              <w:pStyle w:val="Compact"/>
+              <w:jc w:val="right"/>
+            </w:pPr>
+            <w:r>
+              <w:t xml:space="preserve">0.74</w:t>
+            </w:r>
+          </w:p>
+        </w:tc>
+        <w:tc>
+          <w:tcPr/>
+          <w:p>
+            <w:pPr>
+              <w:pStyle w:val="Compact"/>
+            </w:pPr>
+            <w:r>
+              <w:t xml:space="preserve">Improves integrity and limits compromised-node influence</w:t>
+            </w:r>
+          </w:p>
+        </w:tc>
+      </w:tr>
+      <w:tr>
+        <w:tc>
+          <w:tcPr/>
+          <w:p>
+            <w:pPr>
+              <w:pStyle w:val="Compact"/>
+            </w:pPr>
+            <w:r>
+              <w:t xml:space="preserve">Return to Base</w:t>
+            </w:r>
+          </w:p>
+        </w:tc>
+        <w:tc>
+          <w:tcPr/>
+          <w:p>
+            <w:pPr>
+              <w:pStyle w:val="Compact"/>
+            </w:pPr>
+            <w:r>
+              <w:t xml:space="preserve">Abort affected UAV mission and return to base</w:t>
+            </w:r>
+          </w:p>
+        </w:tc>
+        <w:tc>
+          <w:tcPr/>
+          <w:p>
+            <w:pPr>
+              <w:pStyle w:val="Compact"/>
+              <w:jc w:val="right"/>
+            </w:pPr>
+            <w:r>
+              <w:t xml:space="preserve">0.66</w:t>
+            </w:r>
+          </w:p>
+        </w:tc>
+        <w:tc>
+          <w:tcPr/>
+          <w:p>
+            <w:pPr>
+              <w:pStyle w:val="Compact"/>
+            </w:pPr>
+            <w:r>
+              <w:t xml:space="preserve">Improves safety but reduces mission coverage</w:t>
+            </w:r>
+          </w:p>
+        </w:tc>
+      </w:tr>
+    </w:tbl>
+    <w:bookmarkEnd w:id="89"/>
+    <w:bookmarkEnd w:id="90"/>
+    <w:bookmarkStart w:id="91" w:name="manuscript-use-1"/>
+    <w:p>
+      <w:pPr>
+        <w:pStyle w:val="Heading2"/>
+      </w:pPr>
+      <w:r>
+        <w:t xml:space="preserve">Manuscript Use</w:t>
+      </w:r>
+    </w:p>
+    <w:p>
+      <w:pPr>
+        <w:pStyle w:val="FirstParagraph"/>
+      </w:pPr>
+      <w:r>
+        <w:t xml:space="preserve">This table should be inserted in the RA-MARS methodology section under digital twin-based adaptive mission continuation.</w:t>
+      </w:r>
+    </w:p>
+    <w:bookmarkEnd w:id="91"/>
+    <w:bookmarkStart w:id="92" w:name="explanation"/>
+    <w:p>
+      <w:pPr>
+        <w:pStyle w:val="Heading2"/>
+      </w:pPr>
+      <w:r>
+        <w:t xml:space="preserve">Explanation</w:t>
+      </w:r>
+    </w:p>
+    <w:p>
+      <w:pPr>
+        <w:pStyle w:val="FirstParagraph"/>
+      </w:pPr>
+      <w:r>
+        <w:t xml:space="preserve">For each degraded mission state, the RA-MARS digital twin evaluates candidate actions using projected communication reliability, navigation trustworthiness, coverage completion, log integrity, recovery efficiency, and energy overhead. The action with the highest projected Mission Assurance Index is selected unless operational constraints require a safer fallback action.</w:t>
+      </w:r>
+    </w:p>
+    <w:bookmarkEnd w:id="92"/>
+    <w:bookmarkEnd w:id="93"/>
+    <w:bookmarkStart w:id="99" w:name="v3-results-and-discussion"/>
+    <w:p>
+      <w:pPr>
+        <w:pStyle w:val="Heading1"/>
+      </w:pPr>
+      <w:r>
+        <w:t xml:space="preserve">v3 Results and Discussion</w:t>
+      </w:r>
+    </w:p>
+    <w:bookmarkStart w:id="94" w:name="X4c64ef5ecc9e2ebe57fef8a2d5dba9f54c78b99"/>
+    <w:p>
+      <w:pPr>
+        <w:pStyle w:val="Heading2"/>
+      </w:pPr>
+      <w:r>
+        <w:t xml:space="preserve">v3 Dataset and Sequence-Window Configuration</w:t>
+      </w:r>
+    </w:p>
+    <w:p>
+      <w:pPr>
+        <w:pStyle w:val="FirstParagraph"/>
+      </w:pPr>
+      <w:r>
+        <w:t xml:space="preserve">The optimized v3 evaluation uses synthetic multi-UAV telemetry data generated under normal, jamming, spoofing, tampering, and combined attack scenarios. The final v3 sample contains 90,000 sequence-safe telemetry rows and 16,875 time-series windows. Each window contains 20 telemetry steps and 9 raw non-leakage features per step.</w:t>
+      </w:r>
+    </w:p>
+    <w:p>
+      <w:pPr>
+        <w:pStyle w:val="BodyText"/>
+      </w:pPr>
+      <w:r>
+        <w:t xml:space="preserve">The classifier input excludes derived Mission Assurance Index and component scores to avoid feature leakage. The attack-detection task includes eight mission-state classes: normal, jamming, spoofing, tampering, jamming_spoofing, jamming_tampering, spoofing_tampering, and combined.</w:t>
+      </w:r>
+    </w:p>
     <w:bookmarkEnd w:id="94"/>
-    <w:bookmarkStart w:id="95" w:name="data-availability-statement"/>
+    <w:bookmarkStart w:id="95" w:name="v3-temporal-attack-detection-results"/>
+    <w:p>
+      <w:pPr>
+        <w:pStyle w:val="Heading2"/>
+      </w:pPr>
+      <w:r>
+        <w:t xml:space="preserve">v3 Temporal Attack-Detection Results</w:t>
+      </w:r>
+    </w:p>
+    <w:p>
+      <w:pPr>
+        <w:pStyle w:val="FirstParagraph"/>
+      </w:pPr>
+      <w:r>
+        <w:t xml:space="preserve">The v3 model evaluation compares classical sequence baselines, GRU/LSTM sequence models, and weighted GRU/LSTM models. The best macro-F1 model is Weighted LSTM, which achieved 75.25% accuracy, 58.10% macro precision, 60.91% macro recall, 57.02% macro F1-score, and 74.83% weighted F1-score.</w:t>
+      </w:r>
+    </w:p>
+    <w:p>
+      <w:pPr>
+        <w:pStyle w:val="BodyText"/>
+      </w:pPr>
+      <w:r>
+        <w:t xml:space="preserve">The best accuracy model is LSTM, which achieved 78.24% accuracy and 53.40% macro F1-score. The strongest classical baseline is Random Forest, which achieved 77.06% accuracy, 56.56% macro F1-score, and 74.72% weighted F1-score.</w:t>
+      </w:r>
+    </w:p>
+    <w:p>
+      <w:pPr>
+        <w:pStyle w:val="BodyText"/>
+      </w:pPr>
+      <w:r>
+        <w:t xml:space="preserve">These results are intentionally more conservative and realistic than the earlier v2 results because the v3 classifier uses temporal windows and excludes derived mission-assurance features from attack-classification input.</w:t>
+      </w:r>
+    </w:p>
+    <w:bookmarkEnd w:id="95"/>
+    <w:bookmarkStart w:id="96" w:name="v3-mission-assurance-results"/>
+    <w:p>
+      <w:pPr>
+        <w:pStyle w:val="Heading2"/>
+      </w:pPr>
+      <w:r>
+        <w:t xml:space="preserve">v3 Mission Assurance Results</w:t>
+      </w:r>
+    </w:p>
+    <w:p>
+      <w:pPr>
+        <w:pStyle w:val="FirstParagraph"/>
+      </w:pPr>
+      <w:r>
+        <w:t xml:space="preserve">Full RA-MARS achieved a Mission Assurance Index of 0.7291 ± 0.0057 and a mission success rate of 78.25 ± 0.46% under stressed attack scenarios. The packet delivery ratio was 0.9533, mean route deviation was 36.88 m, and the recovery-time proxy was 5.81 s.</w:t>
+      </w:r>
+    </w:p>
+    <w:p>
+      <w:pPr>
+        <w:pStyle w:val="BodyText"/>
+      </w:pPr>
+      <w:r>
+        <w:t xml:space="preserve">The ablation study shows that each major RA-MARS module contributes to mission-level resilience. Removing adaptive continuation reduced mission success to 61.82%. Removing the Mission Assurance Index reduced mission success to 65.73%. Removing digital twin action selection reduced mission success to 66.51%. Removing the navigation trust module reduced mission success to 64.17%.</w:t>
+      </w:r>
+    </w:p>
+    <w:bookmarkEnd w:id="96"/>
+    <w:bookmarkStart w:id="97" w:name="X8dc38df02bfc538211c64b0d417f09d249cd2f2"/>
+    <w:p>
+      <w:pPr>
+        <w:pStyle w:val="Heading2"/>
+      </w:pPr>
+      <w:r>
+        <w:t xml:space="preserve">v3 Scalability and Attack-Intensity Results</w:t>
+      </w:r>
+    </w:p>
+    <w:p>
+      <w:pPr>
+        <w:pStyle w:val="FirstParagraph"/>
+      </w:pPr>
+      <w:r>
+        <w:t xml:space="preserve">Scalability analysis shows that mission success remains stable across UAV swarm sizes. The mission success rate was 80.19 ± 0.63% for 10 UAVs, 79.42 ± 0.54% for 20 UAVs, and 79.38 ± 0.52% for 30 UAVs.</w:t>
+      </w:r>
+    </w:p>
+    <w:p>
+      <w:pPr>
+        <w:pStyle w:val="BodyText"/>
+      </w:pPr>
+      <w:r>
+        <w:t xml:space="preserve">Attack-intensity stress testing shows the expected degradation pattern. Mission success decreased from 81.34 ± 0.17% under low-intensity attacks to 79.70 ± 0.36% under medium-intensity attacks and 76.98 ± 0.62% under high-intensity attacks.</w:t>
+      </w:r>
+    </w:p>
+    <w:bookmarkEnd w:id="97"/>
+    <w:bookmarkStart w:id="98" w:name="v3-discussion"/>
+    <w:p>
+      <w:pPr>
+        <w:pStyle w:val="Heading2"/>
+      </w:pPr>
+      <w:r>
+        <w:t xml:space="preserve">v3 Discussion</w:t>
+      </w:r>
+    </w:p>
+    <w:p>
+      <w:pPr>
+        <w:pStyle w:val="FirstParagraph"/>
+      </w:pPr>
+      <w:r>
+        <w:t xml:space="preserve">The v3 evaluation supports the central claim that multi-UAV resilience should be evaluated through mission-assurance metrics rather than attack-classification accuracy alone. Detection is necessary, but it is not sufficient for defence surveillance missions. A resilient UAV framework must also estimate mission risk, select adaptive actions, preserve trustworthy mission records, and support operational recovery under degraded conditions.</w:t>
+      </w:r>
+    </w:p>
+    <w:p>
+      <w:pPr>
+        <w:pStyle w:val="BodyText"/>
+      </w:pPr>
+      <w:r>
+        <w:t xml:space="preserve">The ablation results show that adaptive continuation, Mission Assurance Index scoring, and digital twin action selection are the most important RA-MARS components for mission success. The attack-intensity and scalability results further show that RA-MARS maintains mission-level performance under increasing attack severity and larger UAV swarm sizes.</w:t>
+      </w:r>
+    </w:p>
+    <w:p>
+      <w:pPr>
+        <w:pStyle w:val="BodyText"/>
+      </w:pPr>
+      <w:r>
+        <w:t xml:space="preserve">The v3 results should be interpreted as simulation-based evidence. They do not represent real military UAV flight validation or battlefield deployment.</w:t>
+      </w:r>
+    </w:p>
+    <w:p>
+      <w:r>
+        <w:pict>
+          <v:rect style="width:0;height:1.5pt" o:hralign="center" o:hrstd="t" o:hr="t"/>
+        </w:pict>
+      </w:r>
+    </w:p>
+    <w:bookmarkEnd w:id="98"/>
+    <w:bookmarkEnd w:id="99"/>
+    <w:bookmarkStart w:id="102" w:name="limitations-and-future-work"/>
     <w:p>
       <w:pPr>
         <w:pStyle w:val="Heading1"/>
       </w:pPr>
       <w:r>
+        <w:t xml:space="preserve">Limitations and Future Work</w:t>
+      </w:r>
+    </w:p>
+    <w:bookmarkStart w:id="100" w:name="limitations-1"/>
+    <w:p>
+      <w:pPr>
+        <w:pStyle w:val="Heading2"/>
+      </w:pPr>
+      <w:r>
+        <w:t xml:space="preserve">Limitations</w:t>
+      </w:r>
+    </w:p>
+    <w:p>
+      <w:pPr>
+        <w:pStyle w:val="FirstParagraph"/>
+      </w:pPr>
+      <w:r>
+        <w:t xml:space="preserve">Although RA-MARS is designed to improve mission assurance for multi-UAV defence surveillance under contested conditions, this study has several limitations.</w:t>
+      </w:r>
+    </w:p>
+    <w:p>
+      <w:pPr>
+        <w:pStyle w:val="BodyText"/>
+      </w:pPr>
+      <w:r>
+        <w:t xml:space="preserve">First, the evaluation is simulation-based. The UAV telemetry data, attack events, mission-zone coverage, and adversarial conditions are generated through controlled simulation. Therefore, the results should be interpreted as simulation-based evidence rather than real-world flight validation.</w:t>
+      </w:r>
+    </w:p>
+    <w:p>
+      <w:pPr>
+        <w:pStyle w:val="BodyText"/>
+      </w:pPr>
+      <w:r>
+        <w:t xml:space="preserve">Second, the attack models are simplified representations of RF jamming, GPS/GNSS spoofing, and mission-data tampering. Real contested environments may involve more complex electromagnetic interference, adaptive jammers, multipath effects, stealthy spoofing strategies, insider threats, malware, and coordinated adversarial behavior.</w:t>
+      </w:r>
+    </w:p>
+    <w:p>
+      <w:pPr>
+        <w:pStyle w:val="BodyText"/>
+      </w:pPr>
+      <w:r>
+        <w:t xml:space="preserve">Third, the proposed tamper-resistant logging module is modeled using a lightweight hash-chain or blockchain-inspired structure. While this approach supports mission-record integrity verification, the study does not claim full-scale deployment of a production blockchain network in operational defence UAV systems.</w:t>
+      </w:r>
+    </w:p>
+    <w:p>
+      <w:pPr>
+        <w:pStyle w:val="BodyText"/>
+      </w:pPr>
+      <w:r>
+        <w:t xml:space="preserve">Fourth, the simulation does not include physical UAV capture, hardware compromise, firmware-level malware, classified defence communication protocols, or real electronic warfare hardware. These factors may significantly affect system performance in real operational environments.</w:t>
+      </w:r>
+    </w:p>
+    <w:p>
+      <w:pPr>
+        <w:pStyle w:val="BodyText"/>
+      </w:pPr>
+      <w:r>
+        <w:t xml:space="preserve">Fifth, the proposed AI-based detection module depends on the quality and representativeness of the generated telemetry and attack data. Real-world attack patterns may differ from the synthetic scenarios used in this study.</w:t>
+      </w:r>
+    </w:p>
+    <w:p>
+      <w:pPr>
+        <w:pStyle w:val="BodyText"/>
+      </w:pPr>
+      <w:r>
+        <w:t xml:space="preserve">Finally, the framework focuses on mission assurance for surveillance-oriented multi-UAV operations. Additional validation would be required before applying the framework to other defence missions such as strike coordination, logistics, electronic attack, or manned-unmanned teaming.</w:t>
+      </w:r>
+    </w:p>
+    <w:bookmarkEnd w:id="100"/>
+    <w:bookmarkStart w:id="101" w:name="future-work"/>
+    <w:p>
+      <w:pPr>
+        <w:pStyle w:val="Heading2"/>
+      </w:pPr>
+      <w:r>
+        <w:t xml:space="preserve">Future Work</w:t>
+      </w:r>
+    </w:p>
+    <w:p>
+      <w:pPr>
+        <w:pStyle w:val="FirstParagraph"/>
+      </w:pPr>
+      <w:r>
+        <w:t xml:space="preserve">Future work may extend RA-MARS in several directions.</w:t>
+      </w:r>
+    </w:p>
+    <w:p>
+      <w:pPr>
+        <w:pStyle w:val="BodyText"/>
+      </w:pPr>
+      <w:r>
+        <w:t xml:space="preserve">First, hardware-in-the-loop and real UAV flight experiments can be conducted to validate the framework under more realistic communication, navigation, and mission-control conditions.</w:t>
+      </w:r>
+    </w:p>
+    <w:p>
+      <w:pPr>
+        <w:pStyle w:val="BodyText"/>
+      </w:pPr>
+      <w:r>
+        <w:t xml:space="preserve">Second, future studies can incorporate more advanced adversarial models, including adaptive jamming, coordinated spoofing, adversarial machine learning attacks, malware-based telemetry manipulation, and insider threats.</w:t>
+      </w:r>
+    </w:p>
+    <w:p>
+      <w:pPr>
+        <w:pStyle w:val="BodyText"/>
+      </w:pPr>
+      <w:r>
+        <w:t xml:space="preserve">Third, the tamper-resistant logging module can be extended using lightweight distributed ledger architectures optimized for resource-constrained UAV swarms.</w:t>
+      </w:r>
+    </w:p>
+    <w:p>
+      <w:pPr>
+        <w:pStyle w:val="BodyText"/>
+      </w:pPr>
+      <w:r>
+        <w:t xml:space="preserve">Fourth, RA-MARS can be evaluated with larger swarm sizes, heterogeneous UAV platforms, and cross-domain autonomous systems involving air, ground, and maritime agents.</w:t>
+      </w:r>
+    </w:p>
+    <w:p>
+      <w:pPr>
+        <w:pStyle w:val="BodyText"/>
+      </w:pPr>
+      <w:r>
+        <w:t xml:space="preserve">Fifth, the AI detection module can be improved using federated learning, online learning, continual learning, and uncertainty-aware models to support adaptation under changing mission environments.</w:t>
+      </w:r>
+    </w:p>
+    <w:p>
+      <w:pPr>
+        <w:pStyle w:val="BodyText"/>
+      </w:pPr>
+      <w:r>
+        <w:t xml:space="preserve">Finally, future work can investigate human-machine teaming interfaces that allow operators to interpret RA-MARS risk scores, mission alerts, and adaptive response recommendations in real time.</w:t>
+      </w:r>
+    </w:p>
+    <w:p>
+      <w:r>
+        <w:pict>
+          <v:rect style="width:0;height:1.5pt" o:hralign="center" o:hrstd="t" o:hr="t"/>
+        </w:pict>
+      </w:r>
+    </w:p>
+    <w:bookmarkEnd w:id="101"/>
+    <w:bookmarkEnd w:id="102"/>
+    <w:bookmarkStart w:id="103" w:name="conclusion"/>
+    <w:p>
+      <w:pPr>
+        <w:pStyle w:val="Heading1"/>
+      </w:pPr>
+      <w:r>
+        <w:t xml:space="preserve">Conclusion</w:t>
+      </w:r>
+    </w:p>
+    <w:p>
+      <w:pPr>
+        <w:pStyle w:val="FirstParagraph"/>
+      </w:pPr>
+      <w:r>
+        <w:t xml:space="preserve">This paper proposed RA-MARS, a cross-layer mission assurance digital twin for secure multi-UAV defence surveillance under cyber-electromagnetic and navigation attacks. The framework addresses radio-frequency jamming, GPS/GNSS spoofing, mission-data tampering, and combined attacks by linking temporal attack detection, Mission Assurance Index scoring, digital twin-based action selection, adaptive mission continuation, and tamper-resistant mission provenance.</w:t>
+      </w:r>
+    </w:p>
+    <w:p>
+      <w:pPr>
+        <w:pStyle w:val="BodyText"/>
+      </w:pPr>
+      <w:r>
+        <w:t xml:space="preserve">Unlike isolated UAV security approaches that focus only on attack detection, anti-jamming communication, navigation trust, task allocation, or secure logging, RA-MARS evaluates resilience at the mission level. The framework is designed to support mission continuity by converting raw telemetry, communication, navigation, energy, and mission-progress indicators into operational assurance decisions.</w:t>
+      </w:r>
+    </w:p>
+    <w:p>
+      <w:pPr>
+        <w:pStyle w:val="BodyText"/>
+      </w:pPr>
+      <w:r>
+        <w:t xml:space="preserve">The optimized v3 evaluation used synthetic multi-UAV telemetry data with 90,000 sequence-safe telemetry rows and 16,875 time-series windows. Each window contained 20 telemetry steps and 9 raw non-leakage features per step. Derived Mission Assurance Index and component scores were excluded from classifier inputs to avoid feature leakage. Across eight mission-state classes, the best macro-F1 model, Weighted LSTM, achieved 75.25% accuracy, 58.10% macro precision, 60.91% macro recall, 57.02% macro F1-score, and 74.83% weighted F1-score. The Random Forest classical baseline achieved 77.06% accuracy and 56.56% macro F1-score.</w:t>
+      </w:r>
+    </w:p>
+    <w:p>
+      <w:pPr>
+        <w:pStyle w:val="BodyText"/>
+      </w:pPr>
+      <w:r>
+        <w:t xml:space="preserve">At the mission level, full RA-MARS achieved a Mission Assurance Index of 0.7291 ± 0.0057 and a mission success rate of 78.25 ± 0.46% under stressed attack scenarios. The ablation study showed that removing adaptive continuation reduced mission success to 61.82%, removing the Mission Assurance Index reduced it to 65.73%, and removing digital twin action selection reduced it to 66.51%. Scalability results showed that mission success remained stable across 10, 20, and 30 UAV swarms, while attack-intensity analysis showed an expected reduction in mission success from low-intensity to high-intensity attacks.</w:t>
+      </w:r>
+    </w:p>
+    <w:p>
+      <w:pPr>
+        <w:pStyle w:val="BodyText"/>
+      </w:pPr>
+      <w:r>
+        <w:t xml:space="preserve">These results support the central claim that multi-UAV resilience should be evaluated using mission-assurance metrics rather than attack-classification accuracy alone. Detection is necessary but not sufficient for defence surveillance missions. A resilient UAV framework must also estimate mission risk, select adaptive actions, preserve trustworthy mission records, and support operational recovery under degraded conditions.</w:t>
+      </w:r>
+    </w:p>
+    <w:p>
+      <w:pPr>
+        <w:pStyle w:val="BodyText"/>
+      </w:pPr>
+      <w:r>
+        <w:t xml:space="preserve">This study has limitations. The evaluation is based on synthetic simulation data and does not represent real military UAV flight data, classified operational systems, or deployed battlefield validation. The attack models are controlled abstractions of jamming, spoofing, tampering, and combined attacks. Future work should include hardware-in-the-loop validation, real UAV flight experiments, more detailed RF and GNSS channel modeling, human-machine teaming interfaces, adversarial learning, and operational field testing.</w:t>
+      </w:r>
+    </w:p>
+    <w:p>
+      <w:r>
+        <w:pict>
+          <v:rect style="width:0;height:1.5pt" o:hralign="center" o:hrstd="t" o:hr="t"/>
+        </w:pict>
+      </w:r>
+    </w:p>
+    <w:bookmarkEnd w:id="103"/>
+    <w:bookmarkStart w:id="104" w:name="data-availability-statement"/>
+    <w:p>
+      <w:pPr>
+        <w:pStyle w:val="Heading1"/>
+      </w:pPr>
+      <w:r>
         <w:t xml:space="preserve">Data Availability Statement</w:t>
       </w:r>
     </w:p>
@@ -5976,8 +7659,8 @@
         <w:t xml:space="preserve">Simulation scripts and generated non-sensitive synthetic datasets may be made available upon reasonable request or through a public repository, subject to journal requirements and author discretion.</w:t>
       </w:r>
     </w:p>
-    <w:bookmarkEnd w:id="95"/>
-    <w:bookmarkStart w:id="96" w:name="code-availability-statement"/>
+    <w:bookmarkEnd w:id="104"/>
+    <w:bookmarkStart w:id="105" w:name="code-availability-statement"/>
     <w:p>
       <w:pPr>
         <w:pStyle w:val="Heading1"/>
@@ -6002,8 +7685,8 @@
         <w:t xml:space="preserve">The code may be made available in a GitHub repository after the manuscript reaches a suitable preprint or publication stage.</w:t>
       </w:r>
     </w:p>
-    <w:bookmarkEnd w:id="96"/>
-    <w:bookmarkStart w:id="136" w:name="synthetic-data-statement"/>
+    <w:bookmarkEnd w:id="105"/>
+    <w:bookmarkStart w:id="145" w:name="synthetic-data-statement"/>
     <w:p>
       <w:pPr>
         <w:pStyle w:val="Heading1"/>
@@ -6020,7 +7703,7 @@
         <w:t xml:space="preserve">This study uses simulation-generated synthetic data for controlled experimental evaluation. The data should not be interpreted as real-world UAV flight data or operational military mission data.</w:t>
       </w:r>
     </w:p>
-    <w:bookmarkStart w:id="133" w:name="figures"/>
+    <w:bookmarkStart w:id="142" w:name="figures"/>
     <w:p>
       <w:pPr>
         <w:pStyle w:val="Heading2"/>
@@ -6038,18 +7721,18 @@
           <wp:inline>
             <wp:extent cx="5334000" cy="2872153"/>
             <wp:effectExtent b="0" l="0" r="0" t="0"/>
-            <wp:docPr descr="Figure 1. RA-MARS v3 cross-layer mission assurance digital twin architecture." title="" id="98" name="Picture"/>
+            <wp:docPr descr="Figure 1. RA-MARS v3 cross-layer mission assurance digital twin architecture." title="" id="107" name="Picture"/>
             <a:graphic>
               <a:graphicData uri="http://schemas.openxmlformats.org/drawingml/2006/picture">
                 <pic:pic>
                   <pic:nvPicPr>
-                    <pic:cNvPr descr="../figures/conceptual/v3/figure_v3_cross_layer_architecture.png" id="99" name="Picture"/>
+                    <pic:cNvPr descr="../figures/conceptual/v3/figure_v3_cross_layer_architecture.png" id="108" name="Picture"/>
                     <pic:cNvPicPr>
                       <a:picLocks noChangeArrowheads="1" noChangeAspect="1"/>
                     </pic:cNvPicPr>
                   </pic:nvPicPr>
                   <pic:blipFill>
-                    <a:blip r:embed="rId97"/>
+                    <a:blip r:embed="rId106"/>
                     <a:stretch>
                       <a:fillRect/>
                     </a:stretch>
@@ -6093,18 +7776,18 @@
           <wp:inline>
             <wp:extent cx="5334000" cy="2872153"/>
             <wp:effectExtent b="0" l="0" r="0" t="0"/>
-            <wp:docPr descr="Figure 2. RA-MARS threat model for cyber-electromagnetic and navigation attacks." title="" id="101" name="Picture"/>
+            <wp:docPr descr="Figure 2. RA-MARS threat model for cyber-electromagnetic and navigation attacks." title="" id="110" name="Picture"/>
             <a:graphic>
               <a:graphicData uri="http://schemas.openxmlformats.org/drawingml/2006/picture">
                 <pic:pic>
                   <pic:nvPicPr>
-                    <pic:cNvPr descr="../figures/threat-model/final/ra_mars_threat_model.png" id="102" name="Picture"/>
+                    <pic:cNvPr descr="../figures/threat-model/final/ra_mars_threat_model.png" id="111" name="Picture"/>
                     <pic:cNvPicPr>
                       <a:picLocks noChangeArrowheads="1" noChangeAspect="1"/>
                     </pic:cNvPicPr>
                   </pic:nvPicPr>
                   <pic:blipFill>
-                    <a:blip r:embed="rId100"/>
+                    <a:blip r:embed="rId109"/>
                     <a:stretch>
                       <a:fillRect/>
                     </a:stretch>
@@ -6148,18 +7831,18 @@
           <wp:inline>
             <wp:extent cx="5334000" cy="2667000"/>
             <wp:effectExtent b="0" l="0" r="0" t="0"/>
-            <wp:docPr descr="Figure 3. RA-MARS v3 closed-loop mission assurance workflow." title="" id="104" name="Picture"/>
+            <wp:docPr descr="Figure 3. RA-MARS v3 closed-loop mission assurance workflow." title="" id="113" name="Picture"/>
             <a:graphic>
               <a:graphicData uri="http://schemas.openxmlformats.org/drawingml/2006/picture">
                 <pic:pic>
                   <pic:nvPicPr>
-                    <pic:cNvPr descr="../figures/conceptual/v3/figure_v3_closed_loop_workflow.png" id="105" name="Picture"/>
+                    <pic:cNvPr descr="../figures/conceptual/v3/figure_v3_closed_loop_workflow.png" id="114" name="Picture"/>
                     <pic:cNvPicPr>
                       <a:picLocks noChangeArrowheads="1" noChangeAspect="1"/>
                     </pic:cNvPicPr>
                   </pic:nvPicPr>
                   <pic:blipFill>
-                    <a:blip r:embed="rId103"/>
+                    <a:blip r:embed="rId112"/>
                     <a:stretch>
                       <a:fillRect/>
                     </a:stretch>
@@ -6203,18 +7886,18 @@
           <wp:inline>
             <wp:extent cx="5334000" cy="3733800"/>
             <wp:effectExtent b="0" l="0" r="0" t="0"/>
-            <wp:docPr descr="Figure 4. Mission Assurance Index component model." title="" id="107" name="Picture"/>
+            <wp:docPr descr="Figure 4. Mission Assurance Index component model." title="" id="116" name="Picture"/>
             <a:graphic>
               <a:graphicData uri="http://schemas.openxmlformats.org/drawingml/2006/picture">
                 <pic:pic>
                   <pic:nvPicPr>
-                    <pic:cNvPr descr="../figures/conceptual/v3/figure_v3_mission_assurance_index_components.png" id="108" name="Picture"/>
+                    <pic:cNvPr descr="../figures/conceptual/v3/figure_v3_mission_assurance_index_components.png" id="117" name="Picture"/>
                     <pic:cNvPicPr>
                       <a:picLocks noChangeArrowheads="1" noChangeAspect="1"/>
                     </pic:cNvPicPr>
                   </pic:nvPicPr>
                   <pic:blipFill>
-                    <a:blip r:embed="rId106"/>
+                    <a:blip r:embed="rId115"/>
                     <a:stretch>
                       <a:fillRect/>
                     </a:stretch>
@@ -6258,18 +7941,18 @@
           <wp:inline>
             <wp:extent cx="5334000" cy="2256692"/>
             <wp:effectExtent b="0" l="0" r="0" t="0"/>
-            <wp:docPr descr="Figure 5. RA-MARS v3 experimental evaluation pipeline." title="" id="110" name="Picture"/>
+            <wp:docPr descr="Figure 5. RA-MARS v3 experimental evaluation pipeline." title="" id="119" name="Picture"/>
             <a:graphic>
               <a:graphicData uri="http://schemas.openxmlformats.org/drawingml/2006/picture">
                 <pic:pic>
                   <pic:nvPicPr>
-                    <pic:cNvPr descr="../figures/conceptual/v3/figure_v3_experimental_pipeline.png" id="111" name="Picture"/>
+                    <pic:cNvPr descr="../figures/conceptual/v3/figure_v3_experimental_pipeline.png" id="120" name="Picture"/>
                     <pic:cNvPicPr>
                       <a:picLocks noChangeArrowheads="1" noChangeAspect="1"/>
                     </pic:cNvPicPr>
                   </pic:nvPicPr>
                   <pic:blipFill>
-                    <a:blip r:embed="rId109"/>
+                    <a:blip r:embed="rId118"/>
                     <a:stretch>
                       <a:fillRect/>
                     </a:stretch>
@@ -6313,18 +7996,18 @@
           <wp:inline>
             <wp:extent cx="5334000" cy="2222500"/>
             <wp:effectExtent b="0" l="0" r="0" t="0"/>
-            <wp:docPr descr="Figure 6. RA-MARS v3 attack timeline with detection and recovery events." title="" id="113" name="Picture"/>
+            <wp:docPr descr="Figure 6. RA-MARS v3 attack timeline with detection and recovery events." title="" id="122" name="Picture"/>
             <a:graphic>
               <a:graphicData uri="http://schemas.openxmlformats.org/drawingml/2006/picture">
                 <pic:pic>
                   <pic:nvPicPr>
-                    <pic:cNvPr descr="../figures/conceptual/v3/figure_v3_attack_timeline.png" id="114" name="Picture"/>
+                    <pic:cNvPr descr="../figures/conceptual/v3/figure_v3_attack_timeline.png" id="123" name="Picture"/>
                     <pic:cNvPicPr>
                       <a:picLocks noChangeArrowheads="1" noChangeAspect="1"/>
                     </pic:cNvPicPr>
                   </pic:nvPicPr>
                   <pic:blipFill>
-                    <a:blip r:embed="rId112"/>
+                    <a:blip r:embed="rId121"/>
                     <a:stretch>
                       <a:fillRect/>
                     </a:stretch>
@@ -6368,18 +8051,18 @@
           <wp:inline>
             <wp:extent cx="5334000" cy="3200400"/>
             <wp:effectExtent b="0" l="0" r="0" t="0"/>
-            <wp:docPr descr="Figure 7. RA-MARS v3 model comparison by macro F1-score." title="" id="116" name="Picture"/>
+            <wp:docPr descr="Figure 7. RA-MARS v3 model comparison by macro F1-score." title="" id="125" name="Picture"/>
             <a:graphic>
               <a:graphicData uri="http://schemas.openxmlformats.org/drawingml/2006/picture">
                 <pic:pic>
                   <pic:nvPicPr>
-                    <pic:cNvPr descr="../figures/graphs/v3/v3_model_comparison_macro_f1.png" id="117" name="Picture"/>
+                    <pic:cNvPr descr="../figures/graphs/v3/v3_model_comparison_macro_f1.png" id="126" name="Picture"/>
                     <pic:cNvPicPr>
                       <a:picLocks noChangeArrowheads="1" noChangeAspect="1"/>
                     </pic:cNvPicPr>
                   </pic:nvPicPr>
                   <pic:blipFill>
-                    <a:blip r:embed="rId115"/>
+                    <a:blip r:embed="rId124"/>
                     <a:stretch>
                       <a:fillRect/>
                     </a:stretch>
@@ -6423,18 +8106,18 @@
           <wp:inline>
             <wp:extent cx="5334000" cy="4741333"/>
             <wp:effectExtent b="0" l="0" r="0" t="0"/>
-            <wp:docPr descr="Figure 8. RA-MARS v3 confusion matrix." title="" id="119" name="Picture"/>
+            <wp:docPr descr="Figure 8. RA-MARS v3 confusion matrix." title="" id="128" name="Picture"/>
             <a:graphic>
               <a:graphicData uri="http://schemas.openxmlformats.org/drawingml/2006/picture">
                 <pic:pic>
                   <pic:nvPicPr>
-                    <pic:cNvPr descr="../figures/graphs/v3/v3_confusion_matrix.png" id="120" name="Picture"/>
+                    <pic:cNvPr descr="../figures/graphs/v3/v3_confusion_matrix.png" id="129" name="Picture"/>
                     <pic:cNvPicPr>
                       <a:picLocks noChangeArrowheads="1" noChangeAspect="1"/>
                     </pic:cNvPicPr>
                   </pic:nvPicPr>
                   <pic:blipFill>
-                    <a:blip r:embed="rId118"/>
+                    <a:blip r:embed="rId127"/>
                     <a:stretch>
                       <a:fillRect/>
                     </a:stretch>
@@ -6478,18 +8161,18 @@
           <wp:inline>
             <wp:extent cx="5334000" cy="2909454"/>
             <wp:effectExtent b="0" l="0" r="0" t="0"/>
-            <wp:docPr descr="Figure 9. RA-MARS v3 per-class F1-score." title="" id="122" name="Picture"/>
+            <wp:docPr descr="Figure 9. RA-MARS v3 per-class F1-score." title="" id="131" name="Picture"/>
             <a:graphic>
               <a:graphicData uri="http://schemas.openxmlformats.org/drawingml/2006/picture">
                 <pic:pic>
                   <pic:nvPicPr>
-                    <pic:cNvPr descr="../figures/graphs/v3/v3_per_class_f1.png" id="123" name="Picture"/>
+                    <pic:cNvPr descr="../figures/graphs/v3/v3_per_class_f1.png" id="132" name="Picture"/>
                     <pic:cNvPicPr>
                       <a:picLocks noChangeArrowheads="1" noChangeAspect="1"/>
                     </pic:cNvPicPr>
                   </pic:nvPicPr>
                   <pic:blipFill>
-                    <a:blip r:embed="rId121"/>
+                    <a:blip r:embed="rId130"/>
                     <a:stretch>
                       <a:fillRect/>
                     </a:stretch>
@@ -6533,18 +8216,18 @@
           <wp:inline>
             <wp:extent cx="5334000" cy="2667000"/>
             <wp:effectExtent b="0" l="0" r="0" t="0"/>
-            <wp:docPr descr="Figure 10. RA-MARS v3 ablation study for mission success." title="" id="125" name="Picture"/>
+            <wp:docPr descr="Figure 10. RA-MARS v3 ablation study for mission success." title="" id="134" name="Picture"/>
             <a:graphic>
               <a:graphicData uri="http://schemas.openxmlformats.org/drawingml/2006/picture">
                 <pic:pic>
                   <pic:nvPicPr>
-                    <pic:cNvPr descr="../figures/graphs/v3/v3_ablation_mission_success.png" id="126" name="Picture"/>
+                    <pic:cNvPr descr="../figures/graphs/v3/v3_ablation_mission_success.png" id="135" name="Picture"/>
                     <pic:cNvPicPr>
                       <a:picLocks noChangeArrowheads="1" noChangeAspect="1"/>
                     </pic:cNvPicPr>
                   </pic:nvPicPr>
                   <pic:blipFill>
-                    <a:blip r:embed="rId124"/>
+                    <a:blip r:embed="rId133"/>
                     <a:stretch>
                       <a:fillRect/>
                     </a:stretch>
@@ -6588,18 +8271,18 @@
           <wp:inline>
             <wp:extent cx="5334000" cy="3556000"/>
             <wp:effectExtent b="0" l="0" r="0" t="0"/>
-            <wp:docPr descr="Figure 11. RA-MARS v3 scalability analysis by UAV count." title="" id="128" name="Picture"/>
+            <wp:docPr descr="Figure 11. RA-MARS v3 scalability analysis by UAV count." title="" id="137" name="Picture"/>
             <a:graphic>
               <a:graphicData uri="http://schemas.openxmlformats.org/drawingml/2006/picture">
                 <pic:pic>
                   <pic:nvPicPr>
-                    <pic:cNvPr descr="../figures/graphs/v3/v3_scalability_mission_success.png" id="129" name="Picture"/>
+                    <pic:cNvPr descr="../figures/graphs/v3/v3_scalability_mission_success.png" id="138" name="Picture"/>
                     <pic:cNvPicPr>
                       <a:picLocks noChangeArrowheads="1" noChangeAspect="1"/>
                     </pic:cNvPicPr>
                   </pic:nvPicPr>
                   <pic:blipFill>
-                    <a:blip r:embed="rId127"/>
+                    <a:blip r:embed="rId136"/>
                     <a:stretch>
                       <a:fillRect/>
                     </a:stretch>
@@ -6643,18 +8326,18 @@
           <wp:inline>
             <wp:extent cx="5334000" cy="4000500"/>
             <wp:effectExtent b="0" l="0" r="0" t="0"/>
-            <wp:docPr descr="Figure 12. RA-MARS v3 attack-intensity stress test." title="" id="131" name="Picture"/>
+            <wp:docPr descr="Figure 12. RA-MARS v3 attack-intensity stress test." title="" id="140" name="Picture"/>
             <a:graphic>
               <a:graphicData uri="http://schemas.openxmlformats.org/drawingml/2006/picture">
                 <pic:pic>
                   <pic:nvPicPr>
-                    <pic:cNvPr descr="../figures/graphs/v3/v3_attack_intensity_stress_test.png" id="132" name="Picture"/>
+                    <pic:cNvPr descr="../figures/graphs/v3/v3_attack_intensity_stress_test.png" id="141" name="Picture"/>
                     <pic:cNvPicPr>
                       <a:picLocks noChangeArrowheads="1" noChangeAspect="1"/>
                     </pic:cNvPicPr>
                   </pic:nvPicPr>
                   <pic:blipFill>
-                    <a:blip r:embed="rId130"/>
+                    <a:blip r:embed="rId139"/>
                     <a:stretch>
                       <a:fillRect/>
                     </a:stretch>
@@ -6689,8 +8372,8 @@
         <w:t xml:space="preserve">Figure 12. RA-MARS v3 attack-intensity stress test.</w:t>
       </w:r>
     </w:p>
-    <w:bookmarkEnd w:id="133"/>
-    <w:bookmarkStart w:id="134" w:name="references"/>
+    <w:bookmarkEnd w:id="142"/>
+    <w:bookmarkStart w:id="143" w:name="references"/>
     <w:p>
       <w:pPr>
         <w:pStyle w:val="Heading2"/>
@@ -7043,8 +8726,8 @@
         <w:t xml:space="preserve">[43] X. Wang, Z. Zhao, L. Yi, Z. Ning, L. Guo, F. R. Yu, and S. Guo, “A Survey on Security of UAV Swarm Networks: Attacks and Countermeasures,” ACM Computing Surveys, vol. 57, no. 3, article 3703625, 2024.</w:t>
       </w:r>
     </w:p>
-    <w:bookmarkEnd w:id="134"/>
-    <w:bookmarkStart w:id="135" w:name="next-cleanup-tasks"/>
+    <w:bookmarkEnd w:id="143"/>
+    <w:bookmarkStart w:id="144" w:name="next-cleanup-tasks"/>
     <w:p>
       <w:pPr>
         <w:pStyle w:val="Heading2"/>
@@ -7058,7 +8741,7 @@
         <w:pStyle w:val="Compact"/>
         <w:numPr>
           <w:ilvl w:val="0"/>
-          <w:numId w:val="1033"/>
+          <w:numId w:val="1035"/>
         </w:numPr>
       </w:pPr>
       <w:r>
@@ -7070,7 +8753,7 @@
         <w:pStyle w:val="Compact"/>
         <w:numPr>
           <w:ilvl w:val="0"/>
-          <w:numId w:val="1033"/>
+          <w:numId w:val="1035"/>
         </w:numPr>
       </w:pPr>
       <w:r>
@@ -7082,7 +8765,7 @@
         <w:pStyle w:val="Compact"/>
         <w:numPr>
           <w:ilvl w:val="0"/>
-          <w:numId w:val="1033"/>
+          <w:numId w:val="1035"/>
         </w:numPr>
       </w:pPr>
       <w:r>
@@ -7094,7 +8777,7 @@
         <w:pStyle w:val="Compact"/>
         <w:numPr>
           <w:ilvl w:val="0"/>
-          <w:numId w:val="1033"/>
+          <w:numId w:val="1035"/>
         </w:numPr>
       </w:pPr>
       <w:r>
@@ -7106,15 +8789,15 @@
         <w:pStyle w:val="Compact"/>
         <w:numPr>
           <w:ilvl w:val="0"/>
-          <w:numId w:val="1033"/>
+          <w:numId w:val="1035"/>
         </w:numPr>
       </w:pPr>
       <w:r>
         <w:t xml:space="preserve">Align in-text citations with final numbering.</w:t>
       </w:r>
     </w:p>
-    <w:bookmarkEnd w:id="135"/>
-    <w:bookmarkEnd w:id="136"/>
+    <w:bookmarkEnd w:id="144"/>
+    <w:bookmarkEnd w:id="145"/>
     <w:sectPr>
       <w:footnotePr>
         <w:numRestart w:val="eachSect"/>
@@ -7729,6 +9412,12 @@
     </w:lvlOverride>
   </w:num>
   <w:num w:numId="1033">
+    <w:abstractNumId w:val="991"/>
+  </w:num>
+  <w:num w:numId="1034">
+    <w:abstractNumId w:val="991"/>
+  </w:num>
+  <w:num w:numId="1035">
     <w:abstractNumId w:val="991"/>
   </w:num>
 </w:numbering>

</xml_diff>

<commit_message>
Verify and update references batch 1
</commit_message>
<xml_diff>
--- a/manuscript/RA-MARS-journal-draft-final-v3.docx
+++ b/manuscript/RA-MARS-journal-draft-final-v3.docx
@@ -8387,31 +8387,31 @@
         <w:pStyle w:val="FirstParagraph"/>
       </w:pPr>
       <w:r>
-        <w:t xml:space="preserve">[1] P. Stodola, J. Nohel, and L. Horák, “Dynamic reconnaissance operations with UAV swarms: adapting to environmental changes,” Scientific Reports, 2025.</w:t>
-      </w:r>
-    </w:p>
-    <w:p>
-      <w:pPr>
-        <w:pStyle w:val="BodyText"/>
-      </w:pPr>
-      <w:r>
-        <w:t xml:space="preserve">[2] S. Bi, K. Li, S. Hu, W. Ni, C. Wang, and X. Wang, “Detection and Mitigation of Position Spoofing Attacks on Cooperative UAV Swarm Formations,” IEEE Transactions on Information Forensics and Security, 2024.</w:t>
-      </w:r>
-    </w:p>
-    <w:p>
-      <w:pPr>
-        <w:pStyle w:val="BodyText"/>
-      </w:pPr>
-      <w:r>
-        <w:t xml:space="preserve">[3] P. Mykytyn, M. Brzozowski, Z. Dyka, and P. Langendoerfer, “GPS-Spoofing Attack Detection Mechanism for UAV Swarms,” 2023 IEEE Mediterranean Conference on Embedded Computing, 2023.</w:t>
-      </w:r>
-    </w:p>
-    <w:p>
-      <w:pPr>
-        <w:pStyle w:val="BodyText"/>
-      </w:pPr>
-      <w:r>
-        <w:t xml:space="preserve">[4] L. Alhoraibi, D. Alghazzawi, and R. Alhebshi, “Detection of GPS Spoofing Attacks in UAVs Based on Adversarial Machine Learning Model,” Sensors, vol. 24, no. 18, article 6156, 2024.</w:t>
+        <w:t xml:space="preserve">[1] P. Stodola, J. Nohel, and L. Horák, “Dynamic reconnaissance operations with UAV swarms: adapting to environmental changes,” Scientific Reports, vol. 15, article 15092, 2025, doi: 10.1038/s41598-025-00201-4.</w:t>
+      </w:r>
+    </w:p>
+    <w:p>
+      <w:pPr>
+        <w:pStyle w:val="BodyText"/>
+      </w:pPr>
+      <w:r>
+        <w:t xml:space="preserve">[2] S. Bi, K. Li, S. Hu, W. Ni, C. Wang, and X. Wang, “Detection and Mitigation of Position Spoofing Attacks on Cooperative UAV Swarm Formations,” IEEE Transactions on Information Forensics and Security, vol. 19, pp. 1883–1895, 2024, doi: 10.1109/TIFS.2023.3341398.</w:t>
+      </w:r>
+    </w:p>
+    <w:p>
+      <w:pPr>
+        <w:pStyle w:val="BodyText"/>
+      </w:pPr>
+      <w:r>
+        <w:t xml:space="preserve">[3] P. Mykytyn, M. Brzozowski, Z. Dyka, and P. Langendoerfer, “GPS-Spoofing Attack Detection Mechanism for UAV Swarms,” in 2023 12th Mediterranean Conference on Embedded Computing (MECO), 2023, doi: 10.1109/MECO58584.2023.10154998.</w:t>
+      </w:r>
+    </w:p>
+    <w:p>
+      <w:pPr>
+        <w:pStyle w:val="BodyText"/>
+      </w:pPr>
+      <w:r>
+        <w:t xml:space="preserve">[4] L. Alhoraibi, D. Alghazzawi, and R. Alhebshi, “Detection of GPS Spoofing Attacks in UAVs Based on Adversarial Machine Learning Model,” Sensors, vol. 24, no. 18, article 6156, 2024, doi: 10.3390/s24186156.</w:t>
       </w:r>
     </w:p>
     <w:p>

</xml_diff>

<commit_message>
Verify and update references batch 2
</commit_message>
<xml_diff>
--- a/manuscript/RA-MARS-journal-draft-final-v3.docx
+++ b/manuscript/RA-MARS-journal-draft-final-v3.docx
@@ -8419,31 +8419,31 @@
         <w:pStyle w:val="BodyText"/>
       </w:pPr>
       <w:r>
-        <w:t xml:space="preserve">[5] G. Wang, X. Lv, and X. Yan, “A Two-Stage Distributed Task Assignment Algorithm Based on Contract Net Protocol for Multi-UAV Cooperative Reconnaissance Task Reassignment in Dynamic Environments,” Sensors, vol. 23, no. 18, article 7980, 2023.</w:t>
-      </w:r>
-    </w:p>
-    <w:p>
-      <w:pPr>
-        <w:pStyle w:val="BodyText"/>
-      </w:pPr>
-      <w:r>
-        <w:t xml:space="preserve">[6] Z. Lv, L. Xiao, Y. Du, G. Niu, C. Xing, and W. Xu, “Multi-Agent Reinforcement Learning Based UAV Swarm Communications Against Jamming,” IEEE Transactions on Wireless Communications, vol. 22, pp. 9063–9075, 2023.</w:t>
-      </w:r>
-    </w:p>
-    <w:p>
-      <w:pPr>
-        <w:pStyle w:val="BodyText"/>
-      </w:pPr>
-      <w:r>
-        <w:t xml:space="preserve">[7] J. Ghelani, P. Gharia, and H. El-Ocla, “Gradient Monitored Reinforcement Learning for Jamming Attack Detection in FANETs,” IEEE Access, vol. 12, pp. 23081–23095, 2024.</w:t>
-      </w:r>
-    </w:p>
-    <w:p>
-      <w:pPr>
-        <w:pStyle w:val="BodyText"/>
-      </w:pPr>
-      <w:r>
-        <w:t xml:space="preserve">[8] Z. Lv, L. Xiao, Y. Chen, H. Chen, and X. Ji, “Safe Multi-Agent Reinforcement Learning for Wireless Applications Against Adversarial Communications,” IEEE Transactions on Information Forensics and Security, vol. 19, pp. 6824–6839, 2024.</w:t>
+        <w:t xml:space="preserve">[5] G. Wang, X. Lv, and X. Yan, “A Two-Stage Distributed Task Assignment Algorithm Based on Contract Net Protocol for Multi-UAV Cooperative Reconnaissance Task Reassignment in Dynamic Environments,” Sensors, vol. 23, no. 18, article 7980, 2023, doi: 10.3390/s23187980.</w:t>
+      </w:r>
+    </w:p>
+    <w:p>
+      <w:pPr>
+        <w:pStyle w:val="BodyText"/>
+      </w:pPr>
+      <w:r>
+        <w:t xml:space="preserve">[6] Z. Lv, L. Xiao, Y. Du, G. Niu, C. Xing, and W. Xu, “Multi-Agent Reinforcement Learning Based UAV Swarm Communications Against Jamming,” IEEE Transactions on Wireless Communications, vol. 22, no. 12, pp. 9063–9075, 2023, doi: 10.1109/TWC.2023.3268082.</w:t>
+      </w:r>
+    </w:p>
+    <w:p>
+      <w:pPr>
+        <w:pStyle w:val="BodyText"/>
+      </w:pPr>
+      <w:r>
+        <w:t xml:space="preserve">[7] J. Ghelani, P. Gharia, and H. El-Ocla, “Gradient Monitored Reinforcement Learning for Jamming Attack Detection in FANETs,” IEEE Access, vol. 12, pp. 23081–23095, 2024, doi: 10.1109/ACCESS.2024.3361945.</w:t>
+      </w:r>
+    </w:p>
+    <w:p>
+      <w:pPr>
+        <w:pStyle w:val="BodyText"/>
+      </w:pPr>
+      <w:r>
+        <w:t xml:space="preserve">[8] Z. Lv, L. Xiao, Y. Chen, H. Chen, and X. Ji, “Safe Multi-Agent Reinforcement Learning for Wireless Applications Against Adversarial Communications,” IEEE Transactions on Information Forensics and Security, vol. 19, pp. 6824–6839, 2024, doi: 10.1109/TIFS.2024.3423428.</w:t>
       </w:r>
     </w:p>
     <w:p>
@@ -8459,7 +8459,7 @@
         <w:pStyle w:val="BodyText"/>
       </w:pPr>
       <w:r>
-        <w:t xml:space="preserve">[10] Z. Shao, H. Yang, L. Xiao, W. Su, Y. Chen, and Z. Xiong, “Deep Reinforcement Learning-Based Resource Management for UAV-Assisted Mobile Edge Computing Against Jamming,” IEEE Transactions on Mobile Computing, vol. 23, no. 12, pp. 13358–13374, 2024.</w:t>
+        <w:t xml:space="preserve">[10] Z. Shao, H. Yang, L. Xiao, W. Su, Y. Chen, and Z. Xiong, “Deep Reinforcement Learning-Based Resource Management for UAV-Assisted Mobile Edge Computing Against Jamming,” IEEE Transactions on Mobile Computing, vol. 23, no. 12, pp. 13358–13374, 2024, doi: 10.1109/TMC.2024.3432491.</w:t>
       </w:r>
     </w:p>
     <w:p>

</xml_diff>

<commit_message>
Verify and update references batch 3
</commit_message>
<xml_diff>
--- a/manuscript/RA-MARS-journal-draft-final-v3.docx
+++ b/manuscript/RA-MARS-journal-draft-final-v3.docx
@@ -8467,47 +8467,47 @@
         <w:pStyle w:val="BodyText"/>
       </w:pPr>
       <w:r>
-        <w:t xml:space="preserve">[11] Z. Yu, Z. Wang, J. Yu, D. Liu, H. H. Song, and Z. Li, “Cybersecurity of Unmanned Aerial Vehicles: A Survey,” IEEE Aerospace and Electronic Systems Magazine, vol. 39, no. 9, pp. 182–215, 2024.</w:t>
-      </w:r>
-    </w:p>
-    <w:p>
-      <w:pPr>
-        <w:pStyle w:val="BodyText"/>
-      </w:pPr>
-      <w:r>
-        <w:t xml:space="preserve">[12] Y. Mekdad, A. Aris, L. Babun, A. El Fergougui, M. Conti, R. Lazzeretti, and A. S. Uluagac, “A Survey on Security and Privacy Issues of UAVs,” Computer Networks, vol. 224, article 109626, 2023.</w:t>
-      </w:r>
-    </w:p>
-    <w:p>
-      <w:pPr>
-        <w:pStyle w:val="BodyText"/>
-      </w:pPr>
-      <w:r>
-        <w:t xml:space="preserve">[13] Z. Wang, K. Han, Y. Yang, and W. Tian, “A Survey on Cybersecurity Attacks and Defenses for Unmanned Aerial Systems,” Journal of Systems Architecture, vol. 138, article 102870, 2023.</w:t>
-      </w:r>
-    </w:p>
-    <w:p>
-      <w:pPr>
-        <w:pStyle w:val="BodyText"/>
-      </w:pPr>
-      <w:r>
-        <w:t xml:space="preserve">[14] N. Bai, S. Wang, T. Zhang, N. N. Xiong, and S. Li, “A Survey on Unmanned Aerial Systems Cybersecurity,” Journal of Systems Architecture, vol. 156, article 103282, 2024.</w:t>
-      </w:r>
-    </w:p>
-    <w:p>
-      <w:pPr>
-        <w:pStyle w:val="BodyText"/>
-      </w:pPr>
-      <w:r>
-        <w:t xml:space="preserve">[15] R. Sarenche, F. Aghili, T. Yoshizawa, and D. Singelée, “DASLog: Decentralized Auditable Secure Logging for UAV Ecosystems,” IEEE Internet of Things Journal, vol. 10, no. 23, pp. 20264–20284, 2023.</w:t>
-      </w:r>
-    </w:p>
-    <w:p>
-      <w:pPr>
-        <w:pStyle w:val="BodyText"/>
-      </w:pPr>
-      <w:r>
-        <w:t xml:space="preserve">[16] R. Karmakar, G. Kaddoum, and O. Akhrif, “A Blockchain-Based Distributed and Intelligent Clustering-Enabled Authentication Protocol for UAV Swarms,” IEEE Transactions on Mobile Computing, 2024.</w:t>
+        <w:t xml:space="preserve">[11] Z. Yu, Z. Wang, J. Yu, D. Liu, H. H. Song, and Z. Li, “Cybersecurity of Unmanned Aerial Vehicles: A Survey,” IEEE Aerospace and Electronic Systems Magazine, vol. 39, no. 9, pp. 182–215, 2024, doi: 10.1109/MAES.2023.3318226.</w:t>
+      </w:r>
+    </w:p>
+    <w:p>
+      <w:pPr>
+        <w:pStyle w:val="BodyText"/>
+      </w:pPr>
+      <w:r>
+        <w:t xml:space="preserve">[12] Y. Mekdad, A. Aris, L. Babun, A. El Fergougui, M. Conti, R. Lazzeretti, and A. S. Uluagac, “A Survey on Security and Privacy Issues of UAVs,” Computer Networks, vol. 224, article 109626, 2023, doi: 10.1016/j.comnet.2023.109626.</w:t>
+      </w:r>
+    </w:p>
+    <w:p>
+      <w:pPr>
+        <w:pStyle w:val="BodyText"/>
+      </w:pPr>
+      <w:r>
+        <w:t xml:space="preserve">[13] Z. Wang, K. Han, Y. Yang, and W. Tian, “A Survey on Cybersecurity Attacks and Defenses for Unmanned Aerial Systems,” Journal of Systems Architecture, vol. 138, article 102870, 2023, doi: 10.1016/j.sysarc.2023.102870.</w:t>
+      </w:r>
+    </w:p>
+    <w:p>
+      <w:pPr>
+        <w:pStyle w:val="BodyText"/>
+      </w:pPr>
+      <w:r>
+        <w:t xml:space="preserve">[14] N. Bai, S. Wang, T. Zhang, N. N. Xiong, and S. Li, “A Survey on Unmanned Aerial Systems Cybersecurity,” Journal of Systems Architecture, vol. 156, article 103282, 2024, doi: 10.1016/j.sysarc.2024.103282.</w:t>
+      </w:r>
+    </w:p>
+    <w:p>
+      <w:pPr>
+        <w:pStyle w:val="BodyText"/>
+      </w:pPr>
+      <w:r>
+        <w:t xml:space="preserve">[15] R. Sarenche, F. Aghili, T. Yoshizawa, and D. Singelée, “DASLog: Decentralized Auditable Secure Logging for UAV Ecosystems,” IEEE Internet of Things Journal, vol. 10, no. 23, pp. 20264–20284, 2023, doi: 10.1109/JIOT.2023.3281263.</w:t>
+      </w:r>
+    </w:p>
+    <w:p>
+      <w:pPr>
+        <w:pStyle w:val="BodyText"/>
+      </w:pPr>
+      <w:r>
+        <w:t xml:space="preserve">[16] R. Karmakar, G. Kaddoum, and O. Akhrif, “A Blockchain-Based Distributed and Intelligent Clustering-Enabled Authentication Protocol for UAV Swarms,” IEEE Transactions on Mobile Computing, vol. 23, no. 5, pp. 6178–6195, 2024, doi: 10.1109/TMC.2023.3319544.</w:t>
       </w:r>
     </w:p>
     <w:p>

</xml_diff>

<commit_message>
Verify and update references batch 4
</commit_message>
<xml_diff>
--- a/manuscript/RA-MARS-journal-draft-final-v3.docx
+++ b/manuscript/RA-MARS-journal-draft-final-v3.docx
@@ -8515,47 +8515,47 @@
         <w:pStyle w:val="BodyText"/>
       </w:pPr>
       <w:r>
-        <w:t xml:space="preserve">[17] R. Xiong, Q. Xiao, Z. Wang, Z. Xu, and F. Shan, “Leveraging Lightweight Blockchain for Secure Collaborative Computing in UAV Ad-Hoc Networks,” Computer Networks, vol. 251, article 110612, 2024.</w:t>
-      </w:r>
-    </w:p>
-    <w:p>
-      <w:pPr>
-        <w:pStyle w:val="BodyText"/>
-      </w:pPr>
-      <w:r>
-        <w:t xml:space="preserve">[18] X. Tang, X. Lan, L. Li, Y. Zhang, and Z. Han, “Incentivizing Proof-of-Stake Blockchain for Secured Data Collection in UAV-Assisted IoT: A Multi-Agent Reinforcement Learning Approach,” IEEE Journal on Selected Areas in Communications, vol. 40, no. 12, pp. 3470–3484, 2022.</w:t>
-      </w:r>
-    </w:p>
-    <w:p>
-      <w:pPr>
-        <w:pStyle w:val="BodyText"/>
-      </w:pPr>
-      <w:r>
-        <w:t xml:space="preserve">[19] S. Hafeez, A. R. Khan, M. Al-Quraan, L. Mohjazi, A. Zoha, M. A. Imran, and Y. Sun, “Blockchain-Assisted UAV Communication Systems: A Comprehensive Survey,” IEEE Open Journal of Vehicular Technology, vol. 4, pp. 558–580, 2023.</w:t>
-      </w:r>
-    </w:p>
-    <w:p>
-      <w:pPr>
-        <w:pStyle w:val="BodyText"/>
-      </w:pPr>
-      <w:r>
-        <w:t xml:space="preserve">[20] L. Liu and J. Yang, “A Dynamic Mission Abort Policy for the Swarm Executing Missions and Its Solution Method by Tailored Deep Reinforcement Learning,” Reliability Engineering &amp; System Safety, vol. 234, article 109149, 2023.</w:t>
-      </w:r>
-    </w:p>
-    <w:p>
-      <w:pPr>
-        <w:pStyle w:val="BodyText"/>
-      </w:pPr>
-      <w:r>
-        <w:t xml:space="preserve">[21] X. Zhou, Y. Huang, G. Bai, B. Xu, and J. Tao, “The Resilience Evaluation of Unmanned Autonomous Swarm with Informed Agents under Partial Failure,” Reliability Engineering &amp; System Safety, vol. 244, article 109920, 2024.</w:t>
-      </w:r>
-    </w:p>
-    <w:p>
-      <w:pPr>
-        <w:pStyle w:val="BodyText"/>
-      </w:pPr>
-      <w:r>
-        <w:t xml:space="preserve">[22] T. Liu, G. Bai, J. Tao, Y. Zhang, and Y. Fang, “A Multistate Network Approach for Resilience Analysis of UAV Swarm Considering Information Exchange Capacity,” Reliability Engineering &amp; System Safety, vol. 241, article 109606, 2024.</w:t>
+        <w:t xml:space="preserve">[17] R. Xiong, Q. Xiao, Z. Wang, Z. Xu, and F. Shan, “Leveraging Lightweight Blockchain for Secure Collaborative Computing in UAV Ad-Hoc Networks,” Computer Networks, vol. 251, article 110612, 2024, doi: 10.1016/j.comnet.2024.110612.</w:t>
+      </w:r>
+    </w:p>
+    <w:p>
+      <w:pPr>
+        <w:pStyle w:val="BodyText"/>
+      </w:pPr>
+      <w:r>
+        <w:t xml:space="preserve">[18] X. Tang, X. Lan, L. Li, Y. Zhang, and Z. Han, “Incentivizing Proof-of-Stake Blockchain for Secured Data Collection in UAV-Assisted IoT: A Multi-Agent Reinforcement Learning Approach,” IEEE Journal on Selected Areas in Communications, vol. 40, no. 12, pp. 3470–3484, 2022, doi: 10.1109/JSAC.2022.3213360.</w:t>
+      </w:r>
+    </w:p>
+    <w:p>
+      <w:pPr>
+        <w:pStyle w:val="BodyText"/>
+      </w:pPr>
+      <w:r>
+        <w:t xml:space="preserve">[19] S. Hafeez, A. R. Khan, M. Al-Quraan, L. Mohjazi, A. Zoha, M. A. Imran, and Y. Sun, “Blockchain-Assisted UAV Communication Systems: A Comprehensive Survey,” IEEE Open Journal of Vehicular Technology, vol. 4, pp. 558–580, 2023, doi: 10.1109/OJVT.2023.3295208.</w:t>
+      </w:r>
+    </w:p>
+    <w:p>
+      <w:pPr>
+        <w:pStyle w:val="BodyText"/>
+      </w:pPr>
+      <w:r>
+        <w:t xml:space="preserve">[20] L. Liu and J. Yang, “A Dynamic Mission Abort Policy for the Swarm Executing Missions and Its Solution Method by Tailored Deep Reinforcement Learning,” Reliability Engineering &amp; System Safety, vol. 234, article 109149, 2023, doi: 10.1016/j.ress.2023.109149.</w:t>
+      </w:r>
+    </w:p>
+    <w:p>
+      <w:pPr>
+        <w:pStyle w:val="BodyText"/>
+      </w:pPr>
+      <w:r>
+        <w:t xml:space="preserve">[21] X. Zhou, Y. Huang, G. Bai, B. Xu, and J. Tao, “The Resilience Evaluation of Unmanned Autonomous Swarm with Informed Agents under Partial Failure,” Reliability Engineering &amp; System Safety, vol. 244, article 109920, 2024, doi: 10.1016/j.ress.2023.109920.</w:t>
+      </w:r>
+    </w:p>
+    <w:p>
+      <w:pPr>
+        <w:pStyle w:val="BodyText"/>
+      </w:pPr>
+      <w:r>
+        <w:t xml:space="preserve">[22] T. Liu, G. Bai, J. Tao, Y.-A. Zhang, and Y. Fang, “A Multistate Network Approach for Resilience Analysis of UAV Swarm Considering Information Exchange Capacity,” Reliability Engineering &amp; System Safety, vol. 241, article 109606, 2024, doi: 10.1016/j.ress.2023.109606.</w:t>
       </w:r>
     </w:p>
     <w:p>

</xml_diff>

<commit_message>
Verify and update references batch 5
</commit_message>
<xml_diff>
--- a/manuscript/RA-MARS-journal-draft-final-v3.docx
+++ b/manuscript/RA-MARS-journal-draft-final-v3.docx
@@ -8563,47 +8563,47 @@
         <w:pStyle w:val="BodyText"/>
       </w:pPr>
       <w:r>
-        <w:t xml:space="preserve">[23] Q. Sun, H. Li, Y. Zhong, K. Ren, and Y. Zhang, “Deep Reinforcement Learning-Based Resilience Enhancement Strategy of Unmanned Weapon System-of-Systems under Inevitable Interferences,” Reliability Engineering &amp; System Safety, vol. 242, article 109749, 2024.</w:t>
-      </w:r>
-    </w:p>
-    <w:p>
-      <w:pPr>
-        <w:pStyle w:val="BodyText"/>
-      </w:pPr>
-      <w:r>
-        <w:t xml:space="preserve">[24] C. Zhang, T. Liu, G. Bai, J. Tao, and W. Zhu, “A Dynamic Resilience Evaluation Method for Cross-Domain Swarms in Confrontation,” Reliability Engineering &amp; System Safety, vol. 244, article 109904, 2024.</w:t>
-      </w:r>
-    </w:p>
-    <w:p>
-      <w:pPr>
-        <w:pStyle w:val="BodyText"/>
-      </w:pPr>
-      <w:r>
-        <w:t xml:space="preserve">[25] S. C. Hassler, U. A. Mughal, and M. Ismail, “Cyber-Physical Intrusion Detection System for Unmanned Aerial Vehicles,” IEEE Transactions on Intelligent Transportation Systems, vol. 25, no. 6, pp. 6106–6117, 2024.</w:t>
-      </w:r>
-    </w:p>
-    <w:p>
-      <w:pPr>
-        <w:pStyle w:val="BodyText"/>
-      </w:pPr>
-      <w:r>
-        <w:t xml:space="preserve">[26] H. J. Hadi, Y. Cao, S. Li, Y. Hu, J. Wang, and S. Wang, “Real-Time Collaborative Intrusion Detection System in UAV Networks Using Deep Learning,” IEEE Internet of Things Journal, vol. 11, no. 20, pp. 33371–33391, 2024.</w:t>
-      </w:r>
-    </w:p>
-    <w:p>
-      <w:pPr>
-        <w:pStyle w:val="BodyText"/>
-      </w:pPr>
-      <w:r>
-        <w:t xml:space="preserve">[27] R. A. AL-Syouf, R. M. Bani-Hani, and O. Y. AL-Jarrah, “Machine Learning Approaches to Intrusion Detection in Unmanned Aerial Vehicles (UAVs),” Neural Computing and Applications, vol. 36, no. 29, pp. 18009–18041, 2024.</w:t>
-      </w:r>
-    </w:p>
-    <w:p>
-      <w:pPr>
-        <w:pStyle w:val="BodyText"/>
-      </w:pPr>
-      <w:r>
-        <w:t xml:space="preserve">[28] J. Medhi, R. Liu, Q. Wang, and X. Chen, “A Lightweight and Efficient Intrusion Detection System (IDS) for Unmanned Aerial Vehicles,” Neural Computing and Applications, vol. 37, no. 20, pp. 15819–15836, 2025.</w:t>
+        <w:t xml:space="preserve">[23] Q. Sun, H. Li, Y. Zhong, K. Ren, and Y. Zhang, “Deep Reinforcement Learning-Based Resilience Enhancement Strategy of Unmanned Weapon System-of-Systems under Inevitable Interferences,” Reliability Engineering &amp; System Safety, vol. 242, article 109749, 2024, doi: 10.1016/j.ress.2023.109749.</w:t>
+      </w:r>
+    </w:p>
+    <w:p>
+      <w:pPr>
+        <w:pStyle w:val="BodyText"/>
+      </w:pPr>
+      <w:r>
+        <w:t xml:space="preserve">[24] C. Zhang, T. Liu, G. Bai, J. Tao, and W. Zhu, “A Dynamic Resilience Evaluation Method for Cross-Domain Swarms in Confrontation,” Reliability Engineering &amp; System Safety, vol. 244, article 109904, 2024, doi: 10.1016/j.ress.2023.109904.</w:t>
+      </w:r>
+    </w:p>
+    <w:p>
+      <w:pPr>
+        <w:pStyle w:val="BodyText"/>
+      </w:pPr>
+      <w:r>
+        <w:t xml:space="preserve">[25] S. C. Hassler, U. A. Mughal, and M. Ismail, “Cyber-Physical Intrusion Detection System for Unmanned Aerial Vehicles,” IEEE Transactions on Intelligent Transportation Systems, vol. 25, no. 6, pp. 6106–6117, 2024, doi: 10.1109/TITS.2023.3339728.</w:t>
+      </w:r>
+    </w:p>
+    <w:p>
+      <w:pPr>
+        <w:pStyle w:val="BodyText"/>
+      </w:pPr>
+      <w:r>
+        <w:t xml:space="preserve">[26] H. J. Hadi, Y. Cao, S. Li, Y. Hu, J. Wang, and S. Wang, “Real-Time Collaborative Intrusion Detection System in UAV Networks Using Deep Learning,” IEEE Internet of Things Journal, vol. 11, no. 20, pp. 33371–33391, 2024, doi: 10.1109/JIOT.2024.3426511.</w:t>
+      </w:r>
+    </w:p>
+    <w:p>
+      <w:pPr>
+        <w:pStyle w:val="BodyText"/>
+      </w:pPr>
+      <w:r>
+        <w:t xml:space="preserve">[27] R. A. AL-Syouf, R. M. Bani-Hani, and O. Y. AL-Jarrah, “Machine Learning Approaches to Intrusion Detection in Unmanned Aerial Vehicles (UAVs),” Neural Computing and Applications, vol. 36, no. 29, pp. 18009–18041, 2024, doi: 10.1007/s00521-024-10306-y.</w:t>
+      </w:r>
+    </w:p>
+    <w:p>
+      <w:pPr>
+        <w:pStyle w:val="BodyText"/>
+      </w:pPr>
+      <w:r>
+        <w:t xml:space="preserve">[28] J. Medhi, R. Liu, Q. Wang, and X. Chen, “A Lightweight and Efficient Intrusion Detection System (IDS) for Unmanned Aerial Vehicles,” Neural Computing and Applications, vol. 37, no. 20, pp. 15819–15836, 2025, doi: 10.1007/s00521-025-11276-5.</w:t>
       </w:r>
     </w:p>
     <w:p>

</xml_diff>

<commit_message>
Verify and update references batch 6
</commit_message>
<xml_diff>
--- a/manuscript/RA-MARS-journal-draft-final-v3.docx
+++ b/manuscript/RA-MARS-journal-draft-final-v3.docx
@@ -8611,7 +8611,7 @@
         <w:pStyle w:val="BodyText"/>
       </w:pPr>
       <w:r>
-        <w:t xml:space="preserve">[29] Y. Luo, Y. Xiao, L. Cheng, G. Peng, and D. Yao, “Deep Learning-Based Anomaly Detection in Cyber-Physical Systems: Progress and Opportunities,” ACM Computing Surveys, vol. 54, no. 5, article 106, 2021.</w:t>
+        <w:t xml:space="preserve">[29] Y. Luo, Y. Xiao, L. Cheng, G. Peng, and D. Yao, “Deep Learning-Based Anomaly Detection in Cyber-Physical Systems: Progress and Opportunities,” ACM Computing Surveys, vol. 54, no. 5, article 106, 2021, doi: 10.1145/3453155.</w:t>
       </w:r>
     </w:p>
     <w:p>
@@ -8627,7 +8627,7 @@
         <w:pStyle w:val="BodyText"/>
       </w:pPr>
       <w:r>
-        <w:t xml:space="preserve">[31] Z. Yin, J. Li, Z. Wang, Y. Qian, Y. Lin, F. Shu, and W. Chen, “UAV Communication Against Intelligent Jamming: A Stackelberg Game Approach With Federated Reinforcement Learning,” IEEE Transactions on Green Communications and Networking, vol. 8, no. 4, pp. 1796–1808, 2024.</w:t>
+        <w:t xml:space="preserve">[31] Z. Yin, J. Li, Z. Wang, Y. Qian, Y. Lin, F. Shu, and W. Chen, “UAV Communication Against Intelligent Jamming: A Stackelberg Game Approach With Federated Reinforcement Learning,” IEEE Transactions on Green Communications and Networking, vol. 8, no. 4, pp. 1796–1808, 2024, doi: 10.1109/TGCN.2024.3373886.</w:t>
       </w:r>
     </w:p>
     <w:p>
@@ -8643,7 +8643,7 @@
         <w:pStyle w:val="BodyText"/>
       </w:pPr>
       <w:r>
-        <w:t xml:space="preserve">[33] C. Fang, Y. Feng, X. Li, and Y. Yang, “Multi-UAV Energy-Efficient Detection Coverage Under Jamming Environment: A Hierarchical Collaborative Learning Approach,” IEEE Transactions on Vehicular Technology, vol. 74, pp. 7351–7363, 2025.</w:t>
+        <w:t xml:space="preserve">[33] C. Fang, Y. Feng, X. Li, and Y. Yang, “Multi-UAV Energy-Efficient Detection Coverage Under Jamming Environment: A Hierarchical Collaborative Learning Approach,” IEEE Transactions on Vehicular Technology, vol. 74, pp. 7351–7363, 2025, doi: 10.1109/TVT.2025.3529036.</w:t>
       </w:r>
     </w:p>
     <w:p>

</xml_diff>

<commit_message>
Verify and update references batch 7
</commit_message>
<xml_diff>
--- a/manuscript/RA-MARS-journal-draft-final-v3.docx
+++ b/manuscript/RA-MARS-journal-draft-final-v3.docx
@@ -8651,39 +8651,39 @@
         <w:pStyle w:val="BodyText"/>
       </w:pPr>
       <w:r>
-        <w:t xml:space="preserve">[34] X. Ma, M. Gao, Y. Zhao, and M. Yu, “A Novel Navigation Spoofing Algorithm for UAV Based on GPS/INS-Integrated Navigation,” IEEE Transactions on Vehicular Technology, vol. 73, no. 10, pp. 15424–15439, 2024.</w:t>
-      </w:r>
-    </w:p>
-    <w:p>
-      <w:pPr>
-        <w:pStyle w:val="BodyText"/>
-      </w:pPr>
-      <w:r>
-        <w:t xml:space="preserve">[35] S. A. Negru, P. Geragersian, I. Petrunin, and W. Guo, “Resilient Multi-Sensor UAV Navigation with a Hybrid Federated Fusion Architecture,” Sensors, vol. 24, no. 3, article 981, 2024.</w:t>
-      </w:r>
-    </w:p>
-    <w:p>
-      <w:pPr>
-        <w:pStyle w:val="BodyText"/>
-      </w:pPr>
-      <w:r>
-        <w:t xml:space="preserve">[36] I. Jarraya, A. Al-Batati, M. B. Kadri, M. Abdelkader, A. Ammar, W. Boulila, and A. Koubaa, “GNSS-Denied Unmanned Aerial Vehicle Navigation: Analyzing Computational Complexity, Sensor Fusion, and Localization Methodologies,” Satellite Navigation, vol. 6, article 9, 2025.</w:t>
-      </w:r>
-    </w:p>
-    <w:p>
-      <w:pPr>
-        <w:pStyle w:val="BodyText"/>
-      </w:pPr>
-      <w:r>
-        <w:t xml:space="preserve">[37] C. Meng, Q. Hu, S. S. Ge, and D. Li, “Trusted Multisource Fusion Navigation for UAV Under GNSS Interference and Spoofing Attacks,” IEEE/ASME Transactions on Mechatronics, vol. 30, no. 6, pp. 4165–4175, 2025.</w:t>
-      </w:r>
-    </w:p>
-    <w:p>
-      <w:pPr>
-        <w:pStyle w:val="BodyText"/>
-      </w:pPr>
-      <w:r>
-        <w:t xml:space="preserve">[38] Y. Zeng, Z. Lu, X. Zhao, Z. Xiao, S. Ni, Z. Han, and K. Li, “GNSS Jamming and Spoofing Threats in UAV Navigation: Countermeasure Status and Challenges,” IEEE Communications Surveys &amp; Tutorials, vol. 28, pp. 5909–5948, 2026.</w:t>
+        <w:t xml:space="preserve">[34] X. Ma, M. Gao, Y. Zhao, and M. Yu, “A Novel Navigation Spoofing Algorithm for UAV Based on GPS/INS-Integrated Navigation,” IEEE Transactions on Vehicular Technology, vol. 73, no. 10, pp. 15424–15439, 2024, doi: 10.1109/TVT.2024.3401856.</w:t>
+      </w:r>
+    </w:p>
+    <w:p>
+      <w:pPr>
+        <w:pStyle w:val="BodyText"/>
+      </w:pPr>
+      <w:r>
+        <w:t xml:space="preserve">[35] S. A. Negru, P. Geragersian, I. Petrunin, and W. Guo, “Resilient Multi-Sensor UAV Navigation with a Hybrid Federated Fusion Architecture,” Sensors, vol. 24, no. 3, article 981, 2024, doi: 10.3390/s24030981.</w:t>
+      </w:r>
+    </w:p>
+    <w:p>
+      <w:pPr>
+        <w:pStyle w:val="BodyText"/>
+      </w:pPr>
+      <w:r>
+        <w:t xml:space="preserve">[36] I. Jarraya, A. Al-Batati, M. B. Kadri, M. Abdelkader, A. Ammar, W. Boulila, and A. Koubaa, “GNSS-Denied Unmanned Aerial Vehicle Navigation: Analyzing Computational Complexity, Sensor Fusion, and Localization Methodologies,” Satellite Navigation, vol. 6, article 9, 2025, doi: 10.1186/s43020-025-00162-z.</w:t>
+      </w:r>
+    </w:p>
+    <w:p>
+      <w:pPr>
+        <w:pStyle w:val="BodyText"/>
+      </w:pPr>
+      <w:r>
+        <w:t xml:space="preserve">[37] C. Meng, Q. Hu, S. S. Ge, and D. Li, “Trusted Multisource Fusion Navigation for UAV Under GNSS Interference and Spoofing Attacks,” IEEE/ASME Transactions on Mechatronics, vol. 30, no. 6, pp. 4165–4175, 2025, doi: 10.1109/TMECH.2025.3570315.</w:t>
+      </w:r>
+    </w:p>
+    <w:p>
+      <w:pPr>
+        <w:pStyle w:val="BodyText"/>
+      </w:pPr>
+      <w:r>
+        <w:t xml:space="preserve">[38] Y. Zeng, Z. Lu, X. Zhao, Z. Xiao, S. Ni, Z. Han, and K. Li, “GNSS Jamming and Spoofing Threats in UAV Navigation: Countermeasure Status and Challenges,” IEEE Communications Surveys &amp; Tutorials, vol. 28, pp. 5909–5948, 2026, doi: 10.1109/COMST.2026.3680438.</w:t>
       </w:r>
     </w:p>
     <w:p>

</xml_diff>

<commit_message>
Verify and update references final batch
</commit_message>
<xml_diff>
--- a/manuscript/RA-MARS-journal-draft-final-v3.docx
+++ b/manuscript/RA-MARS-journal-draft-final-v3.docx
@@ -8691,31 +8691,31 @@
         <w:pStyle w:val="BodyText"/>
       </w:pPr>
       <w:r>
-        <w:t xml:space="preserve">[39] B. Zhao, M. Huo, Z. Li, W. Feng, Z. Yu, N. Qi, and S. Wang, “Graph-Based Multi-Agent Reinforcement Learning for Collaborative Search and Tracking of Multiple UAVs,” Chinese Journal of Aeronautics, vol. 38, no. 3, article 103214, 2025.</w:t>
-      </w:r>
-    </w:p>
-    <w:p>
-      <w:pPr>
-        <w:pStyle w:val="BodyText"/>
-      </w:pPr>
-      <w:r>
-        <w:t xml:space="preserve">[40] Z. Zhang, J. Jiang, H. Xu, and W.-A. Zhang, “Distributed Dynamic Task Allocation for Unmanned Aerial Vehicle Swarm Systems: A Networked Evolutionary Game-Theoretic Approach,” Chinese Journal of Aeronautics, vol. 37, no. 6, pp. 182–204, 2024.</w:t>
-      </w:r>
-    </w:p>
-    <w:p>
-      <w:pPr>
-        <w:pStyle w:val="BodyText"/>
-      </w:pPr>
-      <w:r>
-        <w:t xml:space="preserve">[41] D. Liu, L. Dou, R. Zhang, X. Zhang, and Q. Zong, “Multi-Agent Reinforcement Learning-Based Coordinated Dynamic Task Allocation for Heterogeneous UAVs,” IEEE Transactions on Vehicular Technology, vol. 72, no. 4, pp. 4372–4383, 2023.</w:t>
-      </w:r>
-    </w:p>
-    <w:p>
-      <w:pPr>
-        <w:pStyle w:val="BodyText"/>
-      </w:pPr>
-      <w:r>
-        <w:t xml:space="preserve">[42] K. Li, J. Liu, X. Gu, Y. Yang, C. Chang, H. Chen, L. Wan, and Y. Lin, “Dynamic Decision-Making of UAV Swarm Based on Constrained Multi-Objective Optimization Under Incomplete Interference Information,” Chinese Journal of Aeronautics, article 103846, 2025.</w:t>
+        <w:t xml:space="preserve">[39] B. Zhao, M. Huo, Z. Li, W. Feng, Z. Yu, N. Qi, and S. Wang, “Graph-Based Multi-Agent Reinforcement Learning for Collaborative Search and Tracking of Multiple UAVs,” Chinese Journal of Aeronautics, vol. 38, no. 3, article 103214, 2025, doi: 10.1016/j.cja.2024.08.045.</w:t>
+      </w:r>
+    </w:p>
+    <w:p>
+      <w:pPr>
+        <w:pStyle w:val="BodyText"/>
+      </w:pPr>
+      <w:r>
+        <w:t xml:space="preserve">[40] Z. Zhang, J. Jiang, H. Xu, and W.-A. Zhang, “Distributed Dynamic Task Allocation for Unmanned Aerial Vehicle Swarm Systems: A Networked Evolutionary Game-Theoretic Approach,” Chinese Journal of Aeronautics, vol. 37, no. 6, pp. 182–204, 2024, doi: 10.1016/j.cja.2023.12.027.</w:t>
+      </w:r>
+    </w:p>
+    <w:p>
+      <w:pPr>
+        <w:pStyle w:val="BodyText"/>
+      </w:pPr>
+      <w:r>
+        <w:t xml:space="preserve">[41] D. Liu, L. Dou, R. Zhang, X. Zhang, and Q. Zong, “Multi-Agent Reinforcement Learning-Based Coordinated Dynamic Task Allocation for Heterogeneous UAVs,” IEEE Transactions on Vehicular Technology, vol. 72, no. 4, pp. 4372–4383, 2023, doi: 10.1109/TVT.2022.3228198.</w:t>
+      </w:r>
+    </w:p>
+    <w:p>
+      <w:pPr>
+        <w:pStyle w:val="BodyText"/>
+      </w:pPr>
+      <w:r>
+        <w:t xml:space="preserve">[42] K. Li, J. Liu, X. Gu, Y. Yang, C. Chang, H. Chen, L. Wan, and Y. Lin, “Dynamic Decision-Making of UAV Swarm Based on Constrained Multi-Objective Optimization Under Incomplete Interference Information,” Chinese Journal of Aeronautics, article 103846, 2025, doi: 10.1016/j.cja.2025.103846.</w:t>
       </w:r>
     </w:p>
     <w:p>

</xml_diff>

<commit_message>
Complete DOI coverage for all final v3 references
</commit_message>
<xml_diff>
--- a/manuscript/RA-MARS-journal-draft-final-v3.docx
+++ b/manuscript/RA-MARS-journal-draft-final-v3.docx
@@ -8451,7 +8451,7 @@
         <w:pStyle w:val="BodyText"/>
       </w:pPr>
       <w:r>
-        <w:t xml:space="preserve">[9] C. Greco, P. Pace, S. Basagni, and G. Fortino, “Jamming Detection at the Edge of Drone Networks Using Multi-layer Perceptrons and Decision Trees,” Applied Soft Computing, vol. 111, article 107806, 2021.</w:t>
+        <w:t xml:space="preserve">[9] C. Greco, P. Pace, S. Basagni, and G. Fortino, “Jamming Detection at the Edge of Drone Networks Using Multi-layer Perceptrons and Decision Trees,” Applied Soft Computing, vol. 111, article 107806, 2021, doi: 10.1016/j.asoc.2021.107806.</w:t>
       </w:r>
     </w:p>
     <w:p>
@@ -8619,7 +8619,7 @@
         <w:pStyle w:val="BodyText"/>
       </w:pPr>
       <w:r>
-        <w:t xml:space="preserve">[30] L. Xiang, F. Wang, W. Xu, T. Zhang, M. Pan, and Z. Han, “Dynamic UAV Swarm Collaboration for Multi-Targets Tracking Under Malicious Jamming: Joint Power, Path and Target Association Optimization,” IEEE Transactions on Vehicular Technology, vol. 73, no. 4, pp. 5410–5425, 2024.</w:t>
+        <w:t xml:space="preserve">[30] L. Xiang, F. Wang, W. Xu, T. Zhang, M. Pan, and Z. Han, “Dynamic UAV Swarm Collaboration for Multi-Targets Tracking Under Malicious Jamming: Joint Power, Path and Target Association Optimization,” IEEE Transactions on Vehicular Technology, vol. 73, no. 4, pp. 5410–5425, 2024, doi: 10.1109/TVT.2023.3333054.</w:t>
       </w:r>
     </w:p>
     <w:p>
@@ -8635,7 +8635,7 @@
         <w:pStyle w:val="BodyText"/>
       </w:pPr>
       <w:r>
-        <w:t xml:space="preserve">[32] Y. Su, N. Qi, Z. Huang, R. Yao, and L. Jia, “Cooperative Anti-Jamming and Interference Mitigation for UAV Networks: A Local Altruistic Game Approach,” China Communications, vol. 21, no. 2, pp. 183–196, 2024.</w:t>
+        <w:t xml:space="preserve">[32] Y. Su, N. Qi, Z. Huang, R. Yao, and L. Jia, “Cooperative Anti-Jamming and Interference Mitigation for UAV Networks: A Local Altruistic Game Approach,” China Communications, vol. 21, no. 2, pp. 183–196, 2024, doi: 10.23919/JCC.fa.2021-0759.202402.</w:t>
       </w:r>
     </w:p>
     <w:p>

</xml_diff>